<commit_message>
Additional enahnce and validation
</commit_message>
<xml_diff>
--- a/docs/user-manual/Approver2/approver-user-manual-v2.docx
+++ b/docs/user-manual/Approver2/approver-user-manual-v2.docx
@@ -5,14 +5,21 @@
     <w:p>
       <w:pPr>
         <w:spacing w:before="2000"/>
-      </w:pPr>
-    </w:p>
-    <w:p>
-      <w:pPr>
-        <w:jc w:val="center"/>
-      </w:pPr>
-      <w:r>
-        <w:rPr>
+        <w:rPr>
+          <w:rFonts w:ascii="Abadi" w:hAnsi="Abadi"/>
+        </w:rPr>
+      </w:pPr>
+    </w:p>
+    <w:p>
+      <w:pPr>
+        <w:jc w:val="center"/>
+        <w:rPr>
+          <w:rFonts w:ascii="Abadi" w:hAnsi="Abadi"/>
+        </w:rPr>
+      </w:pPr>
+      <w:r>
+        <w:rPr>
+          <w:rFonts w:ascii="Abadi" w:hAnsi="Abadi"/>
           <w:b/>
           <w:bCs/>
           <w:color w:val="145A3A"/>
@@ -24,6 +31,7 @@
       <w:proofErr w:type="spellStart"/>
       <w:r>
         <w:rPr>
+          <w:rFonts w:ascii="Abadi" w:hAnsi="Abadi"/>
           <w:b/>
           <w:bCs/>
           <w:color w:val="145A3A"/>
@@ -38,9 +46,13 @@
       <w:pPr>
         <w:spacing w:before="120" w:after="80"/>
         <w:jc w:val="center"/>
-      </w:pPr>
-      <w:r>
-        <w:rPr>
+        <w:rPr>
+          <w:rFonts w:ascii="Abadi" w:hAnsi="Abadi"/>
+        </w:rPr>
+      </w:pPr>
+      <w:r>
+        <w:rPr>
+          <w:rFonts w:ascii="Abadi" w:hAnsi="Abadi"/>
           <w:b/>
           <w:bCs/>
           <w:color w:val="0F4630"/>
@@ -54,9 +66,13 @@
       <w:pPr>
         <w:spacing w:before="80"/>
         <w:jc w:val="center"/>
-      </w:pPr>
-      <w:r>
-        <w:rPr>
+        <w:rPr>
+          <w:rFonts w:ascii="Abadi" w:hAnsi="Abadi"/>
+        </w:rPr>
+      </w:pPr>
+      <w:r>
+        <w:rPr>
+          <w:rFonts w:ascii="Abadi" w:hAnsi="Abadi"/>
           <w:i/>
           <w:iCs/>
           <w:color w:val="6B7280"/>
@@ -70,9 +86,16 @@
       <w:pPr>
         <w:spacing w:before="600"/>
         <w:jc w:val="center"/>
-      </w:pPr>
-      <w:r>
-        <w:rPr>
+        <w:rPr>
+          <w:rFonts w:ascii="Abadi" w:hAnsi="Abadi"/>
+          <w:color w:val="6B7280"/>
+          <w:sz w:val="20"/>
+          <w:szCs w:val="20"/>
+        </w:rPr>
+      </w:pPr>
+      <w:r>
+        <w:rPr>
+          <w:rFonts w:ascii="Abadi" w:hAnsi="Abadi"/>
           <w:color w:val="6B7280"/>
           <w:sz w:val="20"/>
           <w:szCs w:val="20"/>
@@ -81,21 +104,431 @@
       </w:r>
     </w:p>
     <w:p>
-      <w:r>
-        <w:br w:type="page"/>
-      </w:r>
+      <w:pPr>
+        <w:spacing w:before="600"/>
+        <w:jc w:val="center"/>
+        <w:rPr>
+          <w:rFonts w:ascii="Abadi" w:hAnsi="Abadi"/>
+          <w:color w:val="6B7280"/>
+          <w:sz w:val="20"/>
+          <w:szCs w:val="20"/>
+        </w:rPr>
+      </w:pPr>
+    </w:p>
+    <w:p>
+      <w:pPr>
+        <w:spacing w:before="600"/>
+        <w:jc w:val="center"/>
+        <w:rPr>
+          <w:rFonts w:ascii="Abadi" w:hAnsi="Abadi"/>
+          <w:color w:val="6B7280"/>
+          <w:sz w:val="20"/>
+          <w:szCs w:val="20"/>
+        </w:rPr>
+      </w:pPr>
     </w:p>
     <w:p>
       <w:pPr>
         <w:pStyle w:val="Heading1"/>
         <w:spacing w:before="360" w:after="180"/>
-      </w:pPr>
-      <w:r>
-        <w:rPr>
+        <w:rPr>
+          <w:rFonts w:ascii="Abadi" w:hAnsi="Abadi"/>
+        </w:rPr>
+      </w:pPr>
+      <w:r>
+        <w:rPr>
+          <w:rFonts w:ascii="Abadi" w:hAnsi="Abadi"/>
           <w:b/>
           <w:bCs/>
           <w:color w:val="145A3A"/>
         </w:rPr>
+        <w:t>Quick Reference</w:t>
+      </w:r>
+    </w:p>
+    <w:tbl>
+      <w:tblPr>
+        <w:tblW w:w="5000" w:type="pct"/>
+        <w:tblBorders>
+          <w:top w:val="single" w:sz="4" w:space="0" w:color="auto"/>
+          <w:left w:val="single" w:sz="4" w:space="0" w:color="auto"/>
+          <w:bottom w:val="single" w:sz="4" w:space="0" w:color="auto"/>
+          <w:right w:val="single" w:sz="4" w:space="0" w:color="auto"/>
+          <w:insideH w:val="single" w:sz="4" w:space="0" w:color="auto"/>
+          <w:insideV w:val="single" w:sz="4" w:space="0" w:color="auto"/>
+        </w:tblBorders>
+        <w:tblLook w:val="04A0" w:firstRow="1" w:lastRow="0" w:firstColumn="1" w:lastColumn="0" w:noHBand="0" w:noVBand="1"/>
+      </w:tblPr>
+      <w:tblGrid>
+        <w:gridCol w:w="1864"/>
+        <w:gridCol w:w="7152"/>
+      </w:tblGrid>
+      <w:tr>
+        <w:trPr>
+          <w:tblHeader/>
+        </w:trPr>
+        <w:tc>
+          <w:tcPr>
+            <w:tcW w:w="0" w:type="auto"/>
+            <w:shd w:val="solid" w:color="145A3A" w:fill="145A3A"/>
+          </w:tcPr>
+          <w:p>
+            <w:pPr>
+              <w:rPr>
+                <w:rFonts w:ascii="Abadi" w:hAnsi="Abadi"/>
+              </w:rPr>
+            </w:pPr>
+            <w:r>
+              <w:rPr>
+                <w:rFonts w:ascii="Abadi" w:hAnsi="Abadi"/>
+                <w:b/>
+                <w:bCs/>
+                <w:color w:val="FFFFFF"/>
+              </w:rPr>
+              <w:t>Button</w:t>
+            </w:r>
+          </w:p>
+        </w:tc>
+        <w:tc>
+          <w:tcPr>
+            <w:tcW w:w="0" w:type="auto"/>
+            <w:shd w:val="solid" w:color="145A3A" w:fill="145A3A"/>
+          </w:tcPr>
+          <w:p>
+            <w:pPr>
+              <w:rPr>
+                <w:rFonts w:ascii="Abadi" w:hAnsi="Abadi"/>
+              </w:rPr>
+            </w:pPr>
+            <w:r>
+              <w:rPr>
+                <w:rFonts w:ascii="Abadi" w:hAnsi="Abadi"/>
+                <w:b/>
+                <w:bCs/>
+                <w:color w:val="FFFFFF"/>
+              </w:rPr>
+              <w:t>What it does</w:t>
+            </w:r>
+          </w:p>
+        </w:tc>
+      </w:tr>
+      <w:tr>
+        <w:tc>
+          <w:tcPr>
+            <w:tcW w:w="0" w:type="auto"/>
+          </w:tcPr>
+          <w:p>
+            <w:pPr>
+              <w:rPr>
+                <w:rFonts w:ascii="Abadi" w:hAnsi="Abadi"/>
+              </w:rPr>
+            </w:pPr>
+            <w:r>
+              <w:rPr>
+                <w:rFonts w:ascii="Abadi" w:hAnsi="Abadi"/>
+                <w:b/>
+                <w:bCs/>
+              </w:rPr>
+              <w:t>View Checklist</w:t>
+            </w:r>
+          </w:p>
+        </w:tc>
+        <w:tc>
+          <w:tcPr>
+            <w:tcW w:w="0" w:type="auto"/>
+          </w:tcPr>
+          <w:p>
+            <w:pPr>
+              <w:rPr>
+                <w:rFonts w:ascii="Abadi" w:hAnsi="Abadi"/>
+              </w:rPr>
+            </w:pPr>
+            <w:r>
+              <w:rPr>
+                <w:rFonts w:ascii="Abadi" w:hAnsi="Abadi"/>
+              </w:rPr>
+              <w:t>Open the checklist to review tasks, save progress, decline/hold, or approve.</w:t>
+            </w:r>
+          </w:p>
+        </w:tc>
+      </w:tr>
+      <w:tr>
+        <w:tc>
+          <w:tcPr>
+            <w:tcW w:w="0" w:type="auto"/>
+          </w:tcPr>
+          <w:p>
+            <w:pPr>
+              <w:rPr>
+                <w:rFonts w:ascii="Abadi" w:hAnsi="Abadi"/>
+              </w:rPr>
+            </w:pPr>
+            <w:r>
+              <w:rPr>
+                <w:rFonts w:ascii="Abadi" w:hAnsi="Abadi"/>
+                <w:b/>
+                <w:bCs/>
+              </w:rPr>
+              <w:t>Checklist Status</w:t>
+            </w:r>
+          </w:p>
+        </w:tc>
+        <w:tc>
+          <w:tcPr>
+            <w:tcW w:w="0" w:type="auto"/>
+          </w:tcPr>
+          <w:p>
+            <w:pPr>
+              <w:rPr>
+                <w:rFonts w:ascii="Abadi" w:hAnsi="Abadi"/>
+              </w:rPr>
+            </w:pPr>
+            <w:r>
+              <w:rPr>
+                <w:rFonts w:ascii="Abadi" w:hAnsi="Abadi"/>
+              </w:rPr>
+              <w:t>View a read-only timeline of the employee’s full offboarding progress.</w:t>
+            </w:r>
+          </w:p>
+        </w:tc>
+      </w:tr>
+      <w:tr>
+        <w:tc>
+          <w:tcPr>
+            <w:tcW w:w="0" w:type="auto"/>
+          </w:tcPr>
+          <w:p>
+            <w:pPr>
+              <w:rPr>
+                <w:rFonts w:ascii="Abadi" w:hAnsi="Abadi"/>
+              </w:rPr>
+            </w:pPr>
+            <w:r>
+              <w:rPr>
+                <w:rFonts w:ascii="Abadi" w:hAnsi="Abadi"/>
+                <w:b/>
+                <w:bCs/>
+              </w:rPr>
+              <w:t>Assign Checklist</w:t>
+            </w:r>
+          </w:p>
+        </w:tc>
+        <w:tc>
+          <w:tcPr>
+            <w:tcW w:w="0" w:type="auto"/>
+          </w:tcPr>
+          <w:p>
+            <w:pPr>
+              <w:rPr>
+                <w:rFonts w:ascii="Abadi" w:hAnsi="Abadi"/>
+              </w:rPr>
+            </w:pPr>
+            <w:r>
+              <w:rPr>
+                <w:rFonts w:ascii="Abadi" w:hAnsi="Abadi"/>
+              </w:rPr>
+              <w:t>Reassign unfinished tasks on this checklist to another employee.</w:t>
+            </w:r>
+          </w:p>
+        </w:tc>
+      </w:tr>
+      <w:tr>
+        <w:tc>
+          <w:tcPr>
+            <w:tcW w:w="0" w:type="auto"/>
+          </w:tcPr>
+          <w:p>
+            <w:pPr>
+              <w:rPr>
+                <w:rFonts w:ascii="Abadi" w:hAnsi="Abadi"/>
+              </w:rPr>
+            </w:pPr>
+            <w:r>
+              <w:rPr>
+                <w:rFonts w:ascii="Abadi" w:hAnsi="Abadi"/>
+                <w:b/>
+                <w:bCs/>
+              </w:rPr>
+              <w:t>Save Progress</w:t>
+            </w:r>
+          </w:p>
+        </w:tc>
+        <w:tc>
+          <w:tcPr>
+            <w:tcW w:w="0" w:type="auto"/>
+          </w:tcPr>
+          <w:p>
+            <w:pPr>
+              <w:rPr>
+                <w:rFonts w:ascii="Abadi" w:hAnsi="Abadi"/>
+              </w:rPr>
+            </w:pPr>
+            <w:r>
+              <w:rPr>
+                <w:rFonts w:ascii="Abadi" w:hAnsi="Abadi"/>
+              </w:rPr>
+              <w:t>Record which task(s) you have checked/cleared.</w:t>
+            </w:r>
+          </w:p>
+        </w:tc>
+      </w:tr>
+      <w:tr>
+        <w:tc>
+          <w:tcPr>
+            <w:tcW w:w="0" w:type="auto"/>
+          </w:tcPr>
+          <w:p>
+            <w:pPr>
+              <w:rPr>
+                <w:rFonts w:ascii="Abadi" w:hAnsi="Abadi"/>
+              </w:rPr>
+            </w:pPr>
+            <w:r>
+              <w:rPr>
+                <w:rFonts w:ascii="Abadi" w:hAnsi="Abadi"/>
+                <w:b/>
+                <w:bCs/>
+              </w:rPr>
+              <w:t>Decline</w:t>
+            </w:r>
+          </w:p>
+        </w:tc>
+        <w:tc>
+          <w:tcPr>
+            <w:tcW w:w="0" w:type="auto"/>
+          </w:tcPr>
+          <w:p>
+            <w:pPr>
+              <w:rPr>
+                <w:rFonts w:ascii="Abadi" w:hAnsi="Abadi"/>
+              </w:rPr>
+            </w:pPr>
+            <w:r>
+              <w:rPr>
+                <w:rFonts w:ascii="Abadi" w:hAnsi="Abadi"/>
+              </w:rPr>
+              <w:t>Place the checklist on hold, with a required reason.</w:t>
+            </w:r>
+          </w:p>
+        </w:tc>
+      </w:tr>
+      <w:tr>
+        <w:tc>
+          <w:tcPr>
+            <w:tcW w:w="0" w:type="auto"/>
+          </w:tcPr>
+          <w:p>
+            <w:pPr>
+              <w:rPr>
+                <w:rFonts w:ascii="Abadi" w:hAnsi="Abadi"/>
+              </w:rPr>
+            </w:pPr>
+            <w:r>
+              <w:rPr>
+                <w:rFonts w:ascii="Abadi" w:hAnsi="Abadi"/>
+                <w:b/>
+                <w:bCs/>
+              </w:rPr>
+              <w:t>Remove On Hold</w:t>
+            </w:r>
+          </w:p>
+        </w:tc>
+        <w:tc>
+          <w:tcPr>
+            <w:tcW w:w="0" w:type="auto"/>
+          </w:tcPr>
+          <w:p>
+            <w:pPr>
+              <w:rPr>
+                <w:rFonts w:ascii="Abadi" w:hAnsi="Abadi"/>
+              </w:rPr>
+            </w:pPr>
+            <w:r>
+              <w:rPr>
+                <w:rFonts w:ascii="Abadi" w:hAnsi="Abadi"/>
+              </w:rPr>
+              <w:t>Resume a held checklist, with a required remark.</w:t>
+            </w:r>
+          </w:p>
+        </w:tc>
+      </w:tr>
+      <w:tr>
+        <w:tc>
+          <w:tcPr>
+            <w:tcW w:w="0" w:type="auto"/>
+          </w:tcPr>
+          <w:p>
+            <w:pPr>
+              <w:rPr>
+                <w:rFonts w:ascii="Abadi" w:hAnsi="Abadi"/>
+              </w:rPr>
+            </w:pPr>
+            <w:r>
+              <w:rPr>
+                <w:rFonts w:ascii="Abadi" w:hAnsi="Abadi"/>
+                <w:b/>
+                <w:bCs/>
+              </w:rPr>
+              <w:t>Approve</w:t>
+            </w:r>
+          </w:p>
+        </w:tc>
+        <w:tc>
+          <w:tcPr>
+            <w:tcW w:w="0" w:type="auto"/>
+          </w:tcPr>
+          <w:p>
+            <w:pPr>
+              <w:rPr>
+                <w:rFonts w:ascii="Abadi" w:hAnsi="Abadi"/>
+              </w:rPr>
+            </w:pPr>
+            <w:r>
+              <w:rPr>
+                <w:rFonts w:ascii="Abadi" w:hAnsi="Abadi"/>
+              </w:rPr>
+              <w:t>Submit final approval — only enabled once every task is checked.</w:t>
+            </w:r>
+          </w:p>
+        </w:tc>
+      </w:tr>
+    </w:tbl>
+    <w:p>
+      <w:pPr>
+        <w:spacing w:before="600"/>
+        <w:jc w:val="center"/>
+        <w:rPr>
+          <w:rFonts w:ascii="Abadi" w:hAnsi="Abadi"/>
+        </w:rPr>
+      </w:pPr>
+    </w:p>
+    <w:p>
+      <w:pPr>
+        <w:rPr>
+          <w:rFonts w:ascii="Abadi" w:hAnsi="Abadi"/>
+        </w:rPr>
+      </w:pPr>
+      <w:r>
+        <w:rPr>
+          <w:rFonts w:ascii="Abadi" w:hAnsi="Abadi"/>
+        </w:rPr>
+        <w:br w:type="page"/>
+      </w:r>
+    </w:p>
+    <w:p>
+      <w:pPr>
+        <w:pStyle w:val="Heading1"/>
+        <w:spacing w:before="360" w:after="180"/>
+        <w:rPr>
+          <w:rFonts w:ascii="Abadi" w:hAnsi="Abadi"/>
+        </w:rPr>
+      </w:pPr>
+      <w:r>
+        <w:rPr>
+          <w:rFonts w:ascii="Abadi" w:hAnsi="Abadi"/>
+          <w:b/>
+          <w:bCs/>
+          <w:color w:val="145A3A"/>
+        </w:rPr>
         <w:lastRenderedPageBreak/>
         <w:t>Introduction</w:t>
       </w:r>
@@ -103,24 +536,42 @@
     <w:p>
       <w:pPr>
         <w:spacing w:after="160"/>
-      </w:pPr>
-      <w:r>
+        <w:rPr>
+          <w:rFonts w:ascii="Abadi" w:hAnsi="Abadi"/>
+        </w:rPr>
+      </w:pPr>
+      <w:r>
+        <w:rPr>
+          <w:rFonts w:ascii="Abadi" w:hAnsi="Abadi"/>
+        </w:rPr>
         <w:t xml:space="preserve">This manual explains how to use the CIM </w:t>
       </w:r>
       <w:proofErr w:type="spellStart"/>
       <w:r>
+        <w:rPr>
+          <w:rFonts w:ascii="Abadi" w:hAnsi="Abadi"/>
+        </w:rPr>
         <w:t>OffBoarding</w:t>
       </w:r>
       <w:proofErr w:type="spellEnd"/>
       <w:r>
+        <w:rPr>
+          <w:rFonts w:ascii="Abadi" w:hAnsi="Abadi"/>
+        </w:rPr>
         <w:t xml:space="preserve"> system as an Approver — a Department Head or Clearance Signatory responsible for reviewing and approving checklist items assigned during an employee’s offboarding process.</w:t>
       </w:r>
     </w:p>
     <w:p>
       <w:pPr>
         <w:spacing w:after="160"/>
-      </w:pPr>
-      <w:r>
+        <w:rPr>
+          <w:rFonts w:ascii="Abadi" w:hAnsi="Abadi"/>
+        </w:rPr>
+      </w:pPr>
+      <w:r>
+        <w:rPr>
+          <w:rFonts w:ascii="Abadi" w:hAnsi="Abadi"/>
+        </w:rPr>
         <w:t>As an Approver, you will:</w:t>
       </w:r>
     </w:p>
@@ -132,8 +583,14 @@
           <w:numId w:val="1"/>
         </w:numPr>
         <w:spacing w:after="80"/>
-      </w:pPr>
-      <w:r>
+        <w:rPr>
+          <w:rFonts w:ascii="Abadi" w:hAnsi="Abadi"/>
+        </w:rPr>
+      </w:pPr>
+      <w:r>
+        <w:rPr>
+          <w:rFonts w:ascii="Abadi" w:hAnsi="Abadi"/>
+        </w:rPr>
         <w:t>Log in to the system using your own username and password.</w:t>
       </w:r>
     </w:p>
@@ -145,8 +602,14 @@
           <w:numId w:val="1"/>
         </w:numPr>
         <w:spacing w:after="80"/>
-      </w:pPr>
-      <w:r>
+        <w:rPr>
+          <w:rFonts w:ascii="Abadi" w:hAnsi="Abadi"/>
+        </w:rPr>
+      </w:pPr>
+      <w:r>
+        <w:rPr>
+          <w:rFonts w:ascii="Abadi" w:hAnsi="Abadi"/>
+        </w:rPr>
         <w:t>Review offboarding checklists assigned to you from the Approval page.</w:t>
       </w:r>
     </w:p>
@@ -158,16 +621,28 @@
           <w:numId w:val="1"/>
         </w:numPr>
         <w:spacing w:after="80"/>
-      </w:pPr>
-      <w:r>
+        <w:rPr>
+          <w:rFonts w:ascii="Abadi" w:hAnsi="Abadi"/>
+        </w:rPr>
+      </w:pPr>
+      <w:r>
+        <w:rPr>
+          <w:rFonts w:ascii="Abadi" w:hAnsi="Abadi"/>
+        </w:rPr>
         <w:t xml:space="preserve">Check off completed </w:t>
       </w:r>
       <w:proofErr w:type="gramStart"/>
       <w:r>
+        <w:rPr>
+          <w:rFonts w:ascii="Abadi" w:hAnsi="Abadi"/>
+        </w:rPr>
         <w:t>tasks, or</w:t>
       </w:r>
       <w:proofErr w:type="gramEnd"/>
       <w:r>
+        <w:rPr>
+          <w:rFonts w:ascii="Abadi" w:hAnsi="Abadi"/>
+        </w:rPr>
         <w:t xml:space="preserve"> delegate them to the appropriate task assignee.</w:t>
       </w:r>
     </w:p>
@@ -179,8 +654,14 @@
           <w:numId w:val="1"/>
         </w:numPr>
         <w:spacing w:after="80"/>
-      </w:pPr>
-      <w:r>
+        <w:rPr>
+          <w:rFonts w:ascii="Abadi" w:hAnsi="Abadi"/>
+        </w:rPr>
+      </w:pPr>
+      <w:r>
+        <w:rPr>
+          <w:rFonts w:ascii="Abadi" w:hAnsi="Abadi"/>
+        </w:rPr>
         <w:t>Approve, decline (place on hold), or resume a checklist as needed.</w:t>
       </w:r>
     </w:p>
@@ -192,8 +673,14 @@
           <w:numId w:val="1"/>
         </w:numPr>
         <w:spacing w:after="80"/>
-      </w:pPr>
-      <w:r>
+        <w:rPr>
+          <w:rFonts w:ascii="Abadi" w:hAnsi="Abadi"/>
+        </w:rPr>
+      </w:pPr>
+      <w:r>
+        <w:rPr>
+          <w:rFonts w:ascii="Abadi" w:hAnsi="Abadi"/>
+        </w:rPr>
         <w:t>Receive notifications — in-app and by email — as checklists become ready for your review.</w:t>
       </w:r>
     </w:p>
@@ -205,8 +692,14 @@
           <w:numId w:val="1"/>
         </w:numPr>
         <w:spacing w:after="80"/>
-      </w:pPr>
-      <w:r>
+        <w:rPr>
+          <w:rFonts w:ascii="Abadi" w:hAnsi="Abadi"/>
+        </w:rPr>
+      </w:pPr>
+      <w:r>
+        <w:rPr>
+          <w:rFonts w:ascii="Abadi" w:hAnsi="Abadi"/>
+        </w:rPr>
         <w:t>Approve a checklist directly from an email link, without logging in, once supported conditions are met.</w:t>
       </w:r>
     </w:p>
@@ -214,9 +707,13 @@
       <w:pPr>
         <w:pStyle w:val="Heading1"/>
         <w:spacing w:before="360" w:after="180"/>
-      </w:pPr>
-      <w:r>
-        <w:rPr>
+        <w:rPr>
+          <w:rFonts w:ascii="Abadi" w:hAnsi="Abadi"/>
+        </w:rPr>
+      </w:pPr>
+      <w:r>
+        <w:rPr>
+          <w:rFonts w:ascii="Abadi" w:hAnsi="Abadi"/>
           <w:b/>
           <w:bCs/>
           <w:color w:val="145A3A"/>
@@ -227,25 +724,41 @@
     <w:p>
       <w:pPr>
         <w:spacing w:after="160"/>
-      </w:pPr>
-      <w:r>
+        <w:rPr>
+          <w:rFonts w:ascii="Abadi" w:hAnsi="Abadi"/>
+        </w:rPr>
+      </w:pPr>
+      <w:r>
+        <w:rPr>
+          <w:rFonts w:ascii="Abadi" w:hAnsi="Abadi"/>
+        </w:rPr>
         <w:t xml:space="preserve">Open the CIM </w:t>
       </w:r>
       <w:proofErr w:type="spellStart"/>
       <w:r>
+        <w:rPr>
+          <w:rFonts w:ascii="Abadi" w:hAnsi="Abadi"/>
+        </w:rPr>
         <w:t>OffBoarding</w:t>
       </w:r>
       <w:proofErr w:type="spellEnd"/>
       <w:r>
+        <w:rPr>
+          <w:rFonts w:ascii="Abadi" w:hAnsi="Abadi"/>
+        </w:rPr>
         <w:t xml:space="preserve"> application in your browser and sign in using the username and password provided to you by HR/Admin.</w:t>
       </w:r>
     </w:p>
     <w:p>
       <w:pPr>
         <w:spacing w:after="80"/>
-      </w:pPr>
-      <w:r>
-        <w:rPr>
+        <w:rPr>
+          <w:rFonts w:ascii="Abadi" w:hAnsi="Abadi"/>
+        </w:rPr>
+      </w:pPr>
+      <w:r>
+        <w:rPr>
+          <w:rFonts w:ascii="Abadi" w:hAnsi="Abadi"/>
           <w:b/>
           <w:bCs/>
           <w:color w:val="145A3A"/>
@@ -253,15 +766,22 @@
         <w:t xml:space="preserve">1. </w:t>
       </w:r>
       <w:r>
+        <w:rPr>
+          <w:rFonts w:ascii="Abadi" w:hAnsi="Abadi"/>
+        </w:rPr>
         <w:t>Enter your Username in the Username field.</w:t>
       </w:r>
     </w:p>
     <w:p>
       <w:pPr>
         <w:spacing w:after="80"/>
-      </w:pPr>
-      <w:r>
-        <w:rPr>
+        <w:rPr>
+          <w:rFonts w:ascii="Abadi" w:hAnsi="Abadi"/>
+        </w:rPr>
+      </w:pPr>
+      <w:r>
+        <w:rPr>
+          <w:rFonts w:ascii="Abadi" w:hAnsi="Abadi"/>
           <w:b/>
           <w:bCs/>
           <w:color w:val="145A3A"/>
@@ -269,15 +789,22 @@
         <w:t xml:space="preserve">2. </w:t>
       </w:r>
       <w:r>
+        <w:rPr>
+          <w:rFonts w:ascii="Abadi" w:hAnsi="Abadi"/>
+        </w:rPr>
         <w:t>Enter your Password in the Password field.</w:t>
       </w:r>
     </w:p>
     <w:p>
       <w:pPr>
         <w:spacing w:after="80"/>
-      </w:pPr>
-      <w:r>
-        <w:rPr>
+        <w:rPr>
+          <w:rFonts w:ascii="Abadi" w:hAnsi="Abadi"/>
+        </w:rPr>
+      </w:pPr>
+      <w:r>
+        <w:rPr>
+          <w:rFonts w:ascii="Abadi" w:hAnsi="Abadi"/>
           <w:b/>
           <w:bCs/>
           <w:color w:val="145A3A"/>
@@ -285,6 +812,9 @@
         <w:t xml:space="preserve">3. </w:t>
       </w:r>
       <w:r>
+        <w:rPr>
+          <w:rFonts w:ascii="Abadi" w:hAnsi="Abadi"/>
+        </w:rPr>
         <w:t>Click Sign In.</w:t>
       </w:r>
     </w:p>
@@ -292,9 +822,13 @@
       <w:pPr>
         <w:spacing w:before="120" w:after="120"/>
         <w:jc w:val="center"/>
-      </w:pPr>
-      <w:r>
-        <w:rPr>
+        <w:rPr>
+          <w:rFonts w:ascii="Abadi" w:hAnsi="Abadi"/>
+        </w:rPr>
+      </w:pPr>
+      <w:r>
+        <w:rPr>
+          <w:rFonts w:ascii="Abadi" w:hAnsi="Abadi"/>
           <w:noProof/>
         </w:rPr>
         <w:drawing>
@@ -342,15 +876,17 @@
         <w:spacing w:after="240"/>
         <w:jc w:val="center"/>
         <w:rPr>
-          <w:i/>
-          <w:iCs/>
-          <w:color w:val="6B7280"/>
-          <w:sz w:val="20"/>
-          <w:szCs w:val="20"/>
-        </w:rPr>
-      </w:pPr>
-      <w:r>
-        <w:rPr>
+          <w:rFonts w:ascii="Abadi" w:hAnsi="Abadi"/>
+          <w:i/>
+          <w:iCs/>
+          <w:color w:val="6B7280"/>
+          <w:sz w:val="20"/>
+          <w:szCs w:val="20"/>
+        </w:rPr>
+      </w:pPr>
+      <w:r>
+        <w:rPr>
+          <w:rFonts w:ascii="Abadi" w:hAnsi="Abadi"/>
           <w:i/>
           <w:iCs/>
           <w:color w:val="6B7280"/>
@@ -365,27 +901,44 @@
         <w:spacing w:after="240"/>
         <w:jc w:val="center"/>
         <w:rPr>
-          <w:i/>
-          <w:iCs/>
-          <w:color w:val="6B7280"/>
-          <w:sz w:val="20"/>
-          <w:szCs w:val="20"/>
-        </w:rPr>
-      </w:pPr>
-    </w:p>
-    <w:p>
-      <w:pPr>
-        <w:spacing w:after="240"/>
-        <w:jc w:val="center"/>
+          <w:rFonts w:ascii="Abadi" w:hAnsi="Abadi"/>
+          <w:i/>
+          <w:iCs/>
+          <w:color w:val="6B7280"/>
+          <w:sz w:val="20"/>
+          <w:szCs w:val="20"/>
+        </w:rPr>
+      </w:pPr>
+    </w:p>
+    <w:p>
+      <w:pPr>
+        <w:spacing w:after="240"/>
+        <w:jc w:val="center"/>
+        <w:rPr>
+          <w:rFonts w:ascii="Abadi" w:hAnsi="Abadi"/>
+        </w:rPr>
+      </w:pPr>
+    </w:p>
+    <w:p>
+      <w:pPr>
+        <w:spacing w:after="240"/>
+        <w:jc w:val="center"/>
+        <w:rPr>
+          <w:rFonts w:ascii="Abadi" w:hAnsi="Abadi"/>
+        </w:rPr>
       </w:pPr>
     </w:p>
     <w:p>
       <w:pPr>
         <w:pStyle w:val="Heading1"/>
         <w:spacing w:before="360" w:after="180"/>
-      </w:pPr>
-      <w:r>
-        <w:rPr>
+        <w:rPr>
+          <w:rFonts w:ascii="Abadi" w:hAnsi="Abadi"/>
+        </w:rPr>
+      </w:pPr>
+      <w:r>
+        <w:rPr>
+          <w:rFonts w:ascii="Abadi" w:hAnsi="Abadi"/>
           <w:b/>
           <w:bCs/>
           <w:color w:val="145A3A"/>
@@ -397,8 +950,14 @@
     <w:p>
       <w:pPr>
         <w:spacing w:after="160"/>
-      </w:pPr>
-      <w:r>
+        <w:rPr>
+          <w:rFonts w:ascii="Abadi" w:hAnsi="Abadi"/>
+        </w:rPr>
+      </w:pPr>
+      <w:r>
+        <w:rPr>
+          <w:rFonts w:ascii="Abadi" w:hAnsi="Abadi"/>
+        </w:rPr>
         <w:t>Once logged in, you will be directed to your dashboard. Go to the Approval page (labeled “Your Approval”) to review every offboarding checklist currently assigned to you and awaiting your action.</w:t>
       </w:r>
     </w:p>
@@ -406,9 +965,13 @@
       <w:pPr>
         <w:spacing w:before="120" w:after="120"/>
         <w:jc w:val="center"/>
-      </w:pPr>
-      <w:r>
-        <w:rPr>
+        <w:rPr>
+          <w:rFonts w:ascii="Abadi" w:hAnsi="Abadi"/>
+        </w:rPr>
+      </w:pPr>
+      <w:r>
+        <w:rPr>
+          <w:rFonts w:ascii="Abadi" w:hAnsi="Abadi"/>
           <w:noProof/>
         </w:rPr>
         <w:drawing>
@@ -455,9 +1018,13 @@
       <w:pPr>
         <w:spacing w:after="240"/>
         <w:jc w:val="center"/>
-      </w:pPr>
-      <w:r>
-        <w:rPr>
+        <w:rPr>
+          <w:rFonts w:ascii="Abadi" w:hAnsi="Abadi"/>
+        </w:rPr>
+      </w:pPr>
+      <w:r>
+        <w:rPr>
+          <w:rFonts w:ascii="Abadi" w:hAnsi="Abadi"/>
           <w:i/>
           <w:iCs/>
           <w:color w:val="6B7280"/>
@@ -470,46 +1037,86 @@
     <w:p>
       <w:pPr>
         <w:spacing w:after="160"/>
-      </w:pPr>
-      <w:r>
+        <w:rPr>
+          <w:rFonts w:ascii="Abadi" w:hAnsi="Abadi"/>
+        </w:rPr>
+      </w:pPr>
+      <w:r>
+        <w:rPr>
+          <w:rFonts w:ascii="Abadi" w:hAnsi="Abadi"/>
+        </w:rPr>
         <w:t xml:space="preserve">Each card on this page represents one checklist assigned to you for a specific employee being offboarded. The colored badge in the top-right corner of each card (e.g. “Pending”, “Ready for Approval”) shows the checklist’s </w:t>
       </w:r>
       <w:proofErr w:type="gramStart"/>
       <w:r>
+        <w:rPr>
+          <w:rFonts w:ascii="Abadi" w:hAnsi="Abadi"/>
+        </w:rPr>
         <w:t>current status</w:t>
       </w:r>
       <w:proofErr w:type="gramEnd"/>
       <w:r>
+        <w:rPr>
+          <w:rFonts w:ascii="Abadi" w:hAnsi="Abadi"/>
+        </w:rPr>
         <w:t xml:space="preserve"> </w:t>
       </w:r>
       <w:proofErr w:type="gramStart"/>
       <w:r>
+        <w:rPr>
+          <w:rFonts w:ascii="Abadi" w:hAnsi="Abadi"/>
+        </w:rPr>
         <w:t>at a glance</w:t>
       </w:r>
       <w:proofErr w:type="gramEnd"/>
       <w:r>
+        <w:rPr>
+          <w:rFonts w:ascii="Abadi" w:hAnsi="Abadi"/>
+        </w:rPr>
         <w:t>.</w:t>
       </w:r>
+    </w:p>
+    <w:p>
+      <w:pPr>
+        <w:spacing w:after="160"/>
+        <w:rPr>
+          <w:rFonts w:ascii="Abadi" w:hAnsi="Abadi"/>
+        </w:rPr>
+      </w:pPr>
     </w:p>
     <w:p>
       <w:pPr>
         <w:pStyle w:val="Heading1"/>
         <w:spacing w:before="360" w:after="180"/>
-      </w:pPr>
-      <w:r>
-        <w:rPr>
+        <w:rPr>
+          <w:rFonts w:ascii="Abadi" w:hAnsi="Abadi"/>
           <w:b/>
           <w:bCs/>
           <w:color w:val="145A3A"/>
         </w:rPr>
+      </w:pPr>
+      <w:r>
+        <w:rPr>
+          <w:rFonts w:ascii="Abadi" w:hAnsi="Abadi"/>
+          <w:b/>
+          <w:bCs/>
+          <w:color w:val="145A3A"/>
+        </w:rPr>
         <w:t>3. The Checklist Card — View Checklist, Checklist Status, Assign Checklist</w:t>
       </w:r>
     </w:p>
-    <w:p>
-      <w:pPr>
-        <w:spacing w:after="160"/>
-      </w:pPr>
-      <w:r>
+    <w:p/>
+    <w:p>
+      <w:pPr>
+        <w:spacing w:after="160"/>
+        <w:rPr>
+          <w:rFonts w:ascii="Abadi" w:hAnsi="Abadi"/>
+        </w:rPr>
+      </w:pPr>
+      <w:r>
+        <w:rPr>
+          <w:rFonts w:ascii="Abadi" w:hAnsi="Abadi"/>
+        </w:rPr>
         <w:t>Each checklist card provides three actions:</w:t>
       </w:r>
     </w:p>
@@ -521,8 +1128,14 @@
           <w:numId w:val="1"/>
         </w:numPr>
         <w:spacing w:after="80"/>
-      </w:pPr>
-      <w:r>
+        <w:rPr>
+          <w:rFonts w:ascii="Abadi" w:hAnsi="Abadi"/>
+        </w:rPr>
+      </w:pPr>
+      <w:r>
+        <w:rPr>
+          <w:rFonts w:ascii="Abadi" w:hAnsi="Abadi"/>
+        </w:rPr>
         <w:t>View Checklist — opens the checklist itself, where you review tasks, check off completed items, save progress, decline/hold, or approve. You can open this either by clicking this button or by clicking anywhere on the card.</w:t>
       </w:r>
     </w:p>
@@ -534,8 +1147,14 @@
           <w:numId w:val="1"/>
         </w:numPr>
         <w:spacing w:after="80"/>
-      </w:pPr>
-      <w:r>
+        <w:rPr>
+          <w:rFonts w:ascii="Abadi" w:hAnsi="Abadi"/>
+        </w:rPr>
+      </w:pPr>
+      <w:r>
+        <w:rPr>
+          <w:rFonts w:ascii="Abadi" w:hAnsi="Abadi"/>
+        </w:rPr>
         <w:t>Checklist Status — opens a read-only timeline showing the full history and current progress of this employee’s offboarding, including every action taken so far (submitted, viewed, declined, hold removed, etc.).</w:t>
       </w:r>
     </w:p>
@@ -547,8 +1166,14 @@
           <w:numId w:val="1"/>
         </w:numPr>
         <w:spacing w:after="80"/>
-      </w:pPr>
-      <w:r>
+        <w:rPr>
+          <w:rFonts w:ascii="Abadi" w:hAnsi="Abadi"/>
+        </w:rPr>
+      </w:pPr>
+      <w:r>
+        <w:rPr>
+          <w:rFonts w:ascii="Abadi" w:hAnsi="Abadi"/>
+        </w:rPr>
         <w:t>Assign Checklist (icon-only button) — lets you reassign every not-yet-completed task on this checklist to another employee, when needed.</w:t>
       </w:r>
     </w:p>
@@ -556,9 +1181,13 @@
       <w:pPr>
         <w:spacing w:before="120" w:after="120"/>
         <w:jc w:val="center"/>
-      </w:pPr>
-      <w:r>
-        <w:rPr>
+        <w:rPr>
+          <w:rFonts w:ascii="Abadi" w:hAnsi="Abadi"/>
+        </w:rPr>
+      </w:pPr>
+      <w:r>
+        <w:rPr>
+          <w:rFonts w:ascii="Abadi" w:hAnsi="Abadi"/>
           <w:noProof/>
         </w:rPr>
         <w:lastRenderedPageBreak/>
@@ -606,9 +1235,18 @@
       <w:pPr>
         <w:spacing w:after="240"/>
         <w:jc w:val="center"/>
-      </w:pPr>
-      <w:r>
-        <w:rPr>
+        <w:rPr>
+          <w:rFonts w:ascii="Abadi" w:hAnsi="Abadi"/>
+          <w:i/>
+          <w:iCs/>
+          <w:color w:val="6B7280"/>
+          <w:sz w:val="20"/>
+          <w:szCs w:val="20"/>
+        </w:rPr>
+      </w:pPr>
+      <w:r>
+        <w:rPr>
+          <w:rFonts w:ascii="Abadi" w:hAnsi="Abadi"/>
           <w:i/>
           <w:iCs/>
           <w:color w:val="6B7280"/>
@@ -622,29 +1260,48 @@
       <w:pPr>
         <w:pStyle w:val="Heading1"/>
         <w:spacing w:before="360" w:after="180"/>
-      </w:pPr>
-      <w:r>
-        <w:rPr>
+        <w:rPr>
+          <w:rFonts w:ascii="Abadi" w:hAnsi="Abadi"/>
           <w:b/>
           <w:bCs/>
           <w:color w:val="145A3A"/>
         </w:rPr>
+      </w:pPr>
+      <w:r>
+        <w:rPr>
+          <w:rFonts w:ascii="Abadi" w:hAnsi="Abadi"/>
+          <w:b/>
+          <w:bCs/>
+          <w:color w:val="145A3A"/>
+        </w:rPr>
         <w:t>4. Viewing a Checklist — Task Status, Saving Progress, Declining, Holding, and Approving</w:t>
       </w:r>
     </w:p>
     <w:p>
       <w:pPr>
         <w:spacing w:after="160"/>
-      </w:pPr>
-      <w:r>
+        <w:rPr>
+          <w:rFonts w:ascii="Abadi" w:hAnsi="Abadi"/>
+        </w:rPr>
+      </w:pPr>
+      <w:r>
+        <w:rPr>
+          <w:rFonts w:ascii="Abadi" w:hAnsi="Abadi"/>
+        </w:rPr>
         <w:t xml:space="preserve">Clicking the card itself or the View Checklist button opens the full checklist. Here you can see every task, who it is assigned to, and its </w:t>
       </w:r>
       <w:proofErr w:type="gramStart"/>
       <w:r>
+        <w:rPr>
+          <w:rFonts w:ascii="Abadi" w:hAnsi="Abadi"/>
+        </w:rPr>
         <w:t>current status</w:t>
       </w:r>
       <w:proofErr w:type="gramEnd"/>
       <w:r>
+        <w:rPr>
+          <w:rFonts w:ascii="Abadi" w:hAnsi="Abadi"/>
+        </w:rPr>
         <w:t>, and you can act on it.</w:t>
       </w:r>
     </w:p>
@@ -652,16 +1309,19 @@
       <w:pPr>
         <w:spacing w:before="120" w:after="120"/>
         <w:jc w:val="center"/>
-      </w:pPr>
-      <w:r>
-        <w:rPr>
-          <w:noProof/>
+        <w:rPr>
+          <w:rFonts w:ascii="Abadi" w:hAnsi="Abadi"/>
+        </w:rPr>
+      </w:pPr>
+      <w:r>
+        <w:rPr>
+          <w:rFonts w:ascii="Abadi" w:hAnsi="Abadi"/>
         </w:rPr>
         <w:drawing>
-          <wp:inline distT="0" distB="0" distL="0" distR="0" wp14:anchorId="3C60A834" wp14:editId="6321B1F9">
-            <wp:extent cx="5334000" cy="3333750"/>
-            <wp:effectExtent l="0" t="0" r="0" b="0"/>
-            <wp:docPr id="4" name="Picture 4"/>
+          <wp:inline distT="0" distB="0" distL="0" distR="0" wp14:anchorId="608F6A2F" wp14:editId="46D2DAFA">
+            <wp:extent cx="4351020" cy="3918878"/>
+            <wp:effectExtent l="0" t="0" r="0" b="5715"/>
+            <wp:docPr id="1544921221" name="Picture 1"/>
             <wp:cNvGraphicFramePr>
               <a:graphicFrameLocks xmlns:a="http://schemas.openxmlformats.org/drawingml/2006/main" noChangeAspect="1"/>
             </wp:cNvGraphicFramePr>
@@ -669,22 +1329,19 @@
               <a:graphicData uri="http://schemas.openxmlformats.org/drawingml/2006/picture">
                 <pic:pic xmlns:pic="http://schemas.openxmlformats.org/drawingml/2006/picture">
                   <pic:nvPicPr>
-                    <pic:cNvPr id="0" name=""/>
-                    <pic:cNvPicPr>
-                      <a:picLocks noChangeAspect="1" noChangeArrowheads="1"/>
-                    </pic:cNvPicPr>
+                    <pic:cNvPr id="1544921221" name=""/>
+                    <pic:cNvPicPr/>
                   </pic:nvPicPr>
                   <pic:blipFill>
                     <a:blip r:embed="rId9"/>
-                    <a:srcRect/>
                     <a:stretch>
                       <a:fillRect/>
                     </a:stretch>
                   </pic:blipFill>
-                  <pic:spPr bwMode="auto">
+                  <pic:spPr>
                     <a:xfrm>
                       <a:off x="0" y="0"/>
-                      <a:ext cx="5334000" cy="3333750"/>
+                      <a:ext cx="4373366" cy="3939005"/>
                     </a:xfrm>
                     <a:prstGeom prst="rect">
                       <a:avLst/>
@@ -701,9 +1358,18 @@
       <w:pPr>
         <w:spacing w:after="240"/>
         <w:jc w:val="center"/>
-      </w:pPr>
-      <w:r>
-        <w:rPr>
+        <w:rPr>
+          <w:rFonts w:ascii="Abadi" w:hAnsi="Abadi"/>
+          <w:i/>
+          <w:iCs/>
+          <w:color w:val="6B7280"/>
+          <w:sz w:val="20"/>
+          <w:szCs w:val="20"/>
+        </w:rPr>
+      </w:pPr>
+      <w:r>
+        <w:rPr>
+          <w:rFonts w:ascii="Abadi" w:hAnsi="Abadi"/>
           <w:i/>
           <w:iCs/>
           <w:color w:val="6B7280"/>
@@ -715,62 +1381,30 @@
     </w:p>
     <w:p>
       <w:pPr>
-        <w:spacing w:after="160"/>
-      </w:pPr>
-      <w:r>
-        <w:lastRenderedPageBreak/>
-        <w:t xml:space="preserve">As the Department Head/Clearance Signatory, you </w:t>
-      </w:r>
-      <w:proofErr w:type="gramStart"/>
-      <w:r>
-        <w:t>are able to</w:t>
-      </w:r>
-      <w:proofErr w:type="gramEnd"/>
-      <w:r>
-        <w:t xml:space="preserve"> check any item yourself, even if it is normally completed by its own assigned signatory. Every item must be checked before the checklist can be submitted for approval.</w:t>
-      </w:r>
-    </w:p>
-    <w:p>
-      <w:pPr>
-        <w:pStyle w:val="Heading1"/>
-        <w:spacing w:before="360" w:after="180"/>
-      </w:pPr>
-      <w:r>
-        <w:rPr>
-          <w:b/>
-          <w:bCs/>
-          <w:color w:val="145A3A"/>
-        </w:rPr>
-        <w:t>5. Save Progress</w:t>
-      </w:r>
-    </w:p>
-    <w:p>
-      <w:pPr>
-        <w:spacing w:after="160"/>
-      </w:pPr>
-      <w:r>
-        <w:t>If you want to mark one or more tasks as checked/cleared, tick the checkbox for each completed task, then click Save Progress. This records that the selected task(s) have been checked by you, the Department Head/Clearance Signatory.</w:t>
-      </w:r>
-    </w:p>
-    <w:p>
-      <w:pPr>
-        <w:spacing w:after="160"/>
-      </w:pPr>
-    </w:p>
-    <w:p>
-      <w:pPr>
-        <w:spacing w:before="120" w:after="120"/>
-        <w:jc w:val="center"/>
-      </w:pPr>
-      <w:r>
-        <w:rPr>
-          <w:noProof/>
+        <w:spacing w:after="240"/>
+        <w:jc w:val="center"/>
+        <w:rPr>
+          <w:rFonts w:ascii="Abadi" w:hAnsi="Abadi"/>
+        </w:rPr>
+      </w:pPr>
+    </w:p>
+    <w:p>
+      <w:pPr>
+        <w:spacing w:after="160"/>
+        <w:jc w:val="center"/>
+        <w:rPr>
+          <w:rFonts w:ascii="Abadi" w:hAnsi="Abadi"/>
+        </w:rPr>
+      </w:pPr>
+      <w:r>
+        <w:rPr>
+          <w:rFonts w:ascii="Abadi" w:hAnsi="Abadi"/>
         </w:rPr>
         <w:drawing>
-          <wp:inline distT="0" distB="0" distL="0" distR="0" wp14:anchorId="1EB58A8E" wp14:editId="35912F0C">
-            <wp:extent cx="5334000" cy="3333750"/>
-            <wp:effectExtent l="0" t="0" r="0" b="0"/>
-            <wp:docPr id="5" name="Picture 5"/>
+          <wp:inline distT="0" distB="0" distL="0" distR="0" wp14:anchorId="02548F63" wp14:editId="24EC26F0">
+            <wp:extent cx="4801108" cy="4358640"/>
+            <wp:effectExtent l="0" t="0" r="0" b="3810"/>
+            <wp:docPr id="2078428541" name="Picture 1"/>
             <wp:cNvGraphicFramePr>
               <a:graphicFrameLocks xmlns:a="http://schemas.openxmlformats.org/drawingml/2006/main" noChangeAspect="1"/>
             </wp:cNvGraphicFramePr>
@@ -778,22 +1412,19 @@
               <a:graphicData uri="http://schemas.openxmlformats.org/drawingml/2006/picture">
                 <pic:pic xmlns:pic="http://schemas.openxmlformats.org/drawingml/2006/picture">
                   <pic:nvPicPr>
-                    <pic:cNvPr id="0" name=""/>
-                    <pic:cNvPicPr>
-                      <a:picLocks noChangeAspect="1" noChangeArrowheads="1"/>
-                    </pic:cNvPicPr>
+                    <pic:cNvPr id="2078428541" name=""/>
+                    <pic:cNvPicPr/>
                   </pic:nvPicPr>
                   <pic:blipFill>
                     <a:blip r:embed="rId10"/>
-                    <a:srcRect/>
                     <a:stretch>
                       <a:fillRect/>
                     </a:stretch>
                   </pic:blipFill>
-                  <pic:spPr bwMode="auto">
+                  <pic:spPr>
                     <a:xfrm>
                       <a:off x="0" y="0"/>
-                      <a:ext cx="5334000" cy="3333750"/>
+                      <a:ext cx="4808092" cy="4364980"/>
                     </a:xfrm>
                     <a:prstGeom prst="rect">
                       <a:avLst/>
@@ -811,53 +1442,300 @@
         <w:spacing w:after="240"/>
         <w:jc w:val="center"/>
         <w:rPr>
-          <w:i/>
-          <w:iCs/>
-          <w:color w:val="6B7280"/>
-          <w:sz w:val="20"/>
-          <w:szCs w:val="20"/>
-        </w:rPr>
-      </w:pPr>
-      <w:r>
-        <w:rPr>
-          <w:i/>
-          <w:iCs/>
-          <w:color w:val="6B7280"/>
-          <w:sz w:val="20"/>
-          <w:szCs w:val="20"/>
-        </w:rPr>
-        <w:t>Figure 5.1 — Tasks checked and ready to save.</w:t>
-      </w:r>
-    </w:p>
-    <w:p>
-      <w:pPr>
-        <w:spacing w:after="240"/>
-        <w:jc w:val="center"/>
-      </w:pPr>
-    </w:p>
-    <w:p>
-      <w:pPr>
-        <w:spacing w:after="160"/>
-      </w:pPr>
-      <w:r>
-        <w:t>Once saved, a confirmation notification appears and the checklist’s progress is updated immediately — no need to reload the page.</w:t>
-      </w:r>
+          <w:rFonts w:ascii="Abadi" w:hAnsi="Abadi"/>
+        </w:rPr>
+      </w:pPr>
+      <w:r>
+        <w:rPr>
+          <w:rFonts w:ascii="Abadi" w:hAnsi="Abadi"/>
+          <w:i/>
+          <w:iCs/>
+          <w:color w:val="6B7280"/>
+          <w:sz w:val="20"/>
+          <w:szCs w:val="20"/>
+        </w:rPr>
+        <w:t>Figure 4.</w:t>
+      </w:r>
+      <w:r>
+        <w:rPr>
+          <w:rFonts w:ascii="Abadi" w:hAnsi="Abadi"/>
+          <w:i/>
+          <w:iCs/>
+          <w:color w:val="6B7280"/>
+          <w:sz w:val="20"/>
+          <w:szCs w:val="20"/>
+        </w:rPr>
+        <w:t>2</w:t>
+      </w:r>
+      <w:r>
+        <w:rPr>
+          <w:rFonts w:ascii="Abadi" w:hAnsi="Abadi"/>
+          <w:i/>
+          <w:iCs/>
+          <w:color w:val="6B7280"/>
+          <w:sz w:val="20"/>
+          <w:szCs w:val="20"/>
+        </w:rPr>
+        <w:t xml:space="preserve"> — The checklist view, listing every task </w:t>
+      </w:r>
+      <w:r>
+        <w:rPr>
+          <w:rFonts w:ascii="Abadi" w:hAnsi="Abadi"/>
+          <w:i/>
+          <w:iCs/>
+          <w:color w:val="6B7280"/>
+          <w:sz w:val="20"/>
+          <w:szCs w:val="20"/>
+        </w:rPr>
+        <w:t>cleared by</w:t>
+      </w:r>
+      <w:r>
+        <w:rPr>
+          <w:rFonts w:ascii="Abadi" w:hAnsi="Abadi"/>
+          <w:i/>
+          <w:iCs/>
+          <w:color w:val="6B7280"/>
+          <w:sz w:val="20"/>
+          <w:szCs w:val="20"/>
+        </w:rPr>
+        <w:t xml:space="preserve"> its assignee and </w:t>
+      </w:r>
+      <w:r>
+        <w:rPr>
+          <w:rFonts w:ascii="Abadi" w:hAnsi="Abadi"/>
+          <w:i/>
+          <w:iCs/>
+          <w:color w:val="6B7280"/>
+          <w:sz w:val="20"/>
+          <w:szCs w:val="20"/>
+        </w:rPr>
+        <w:t>their remark</w:t>
+      </w:r>
+      <w:r>
+        <w:rPr>
+          <w:rFonts w:ascii="Abadi" w:hAnsi="Abadi"/>
+          <w:i/>
+          <w:iCs/>
+          <w:color w:val="6B7280"/>
+          <w:sz w:val="20"/>
+          <w:szCs w:val="20"/>
+        </w:rPr>
+        <w:t>.</w:t>
+      </w:r>
+    </w:p>
+    <w:p>
+      <w:pPr>
+        <w:spacing w:after="160"/>
+        <w:rPr>
+          <w:rFonts w:ascii="Abadi" w:hAnsi="Abadi"/>
+        </w:rPr>
+      </w:pPr>
+    </w:p>
+    <w:p>
+      <w:pPr>
+        <w:spacing w:after="160"/>
+        <w:rPr>
+          <w:rFonts w:ascii="Abadi" w:hAnsi="Abadi"/>
+        </w:rPr>
+      </w:pPr>
+      <w:r>
+        <w:rPr>
+          <w:rFonts w:ascii="Abadi" w:hAnsi="Abadi"/>
+        </w:rPr>
+        <w:t xml:space="preserve">As the Department Head/Clearance Signatory, you </w:t>
+      </w:r>
+      <w:proofErr w:type="gramStart"/>
+      <w:r>
+        <w:rPr>
+          <w:rFonts w:ascii="Abadi" w:hAnsi="Abadi"/>
+        </w:rPr>
+        <w:t>are able to</w:t>
+      </w:r>
+      <w:proofErr w:type="gramEnd"/>
+      <w:r>
+        <w:rPr>
+          <w:rFonts w:ascii="Abadi" w:hAnsi="Abadi"/>
+        </w:rPr>
+        <w:t xml:space="preserve"> check any item yourself, even if it is normally completed by its own assigned signatory. Every item must be checked before the checklist can be submitted for approval.</w:t>
+      </w:r>
+    </w:p>
+    <w:p>
+      <w:pPr>
+        <w:spacing w:after="160"/>
+        <w:rPr>
+          <w:rFonts w:ascii="Abadi" w:hAnsi="Abadi"/>
+        </w:rPr>
+      </w:pPr>
+    </w:p>
+    <w:p>
+      <w:pPr>
+        <w:spacing w:after="160"/>
+        <w:rPr>
+          <w:rFonts w:ascii="Abadi" w:hAnsi="Abadi"/>
+        </w:rPr>
+      </w:pPr>
+    </w:p>
+    <w:p>
+      <w:pPr>
+        <w:spacing w:after="160"/>
+        <w:rPr>
+          <w:rFonts w:ascii="Abadi" w:hAnsi="Abadi"/>
+        </w:rPr>
+      </w:pPr>
+    </w:p>
+    <w:p>
+      <w:pPr>
+        <w:spacing w:after="160"/>
+        <w:rPr>
+          <w:rFonts w:ascii="Abadi" w:hAnsi="Abadi"/>
+        </w:rPr>
+      </w:pPr>
+    </w:p>
+    <w:p>
+      <w:pPr>
+        <w:spacing w:after="160"/>
+        <w:rPr>
+          <w:rFonts w:ascii="Abadi" w:hAnsi="Abadi"/>
+        </w:rPr>
+      </w:pPr>
+    </w:p>
+    <w:p>
+      <w:pPr>
+        <w:spacing w:after="160"/>
+        <w:rPr>
+          <w:rFonts w:ascii="Abadi" w:hAnsi="Abadi"/>
+        </w:rPr>
+      </w:pPr>
+    </w:p>
+    <w:p>
+      <w:pPr>
+        <w:spacing w:after="160"/>
+        <w:rPr>
+          <w:rFonts w:ascii="Abadi" w:hAnsi="Abadi"/>
+        </w:rPr>
+      </w:pPr>
+    </w:p>
+    <w:p>
+      <w:pPr>
+        <w:spacing w:after="160"/>
+        <w:rPr>
+          <w:rFonts w:ascii="Abadi" w:hAnsi="Abadi"/>
+        </w:rPr>
+      </w:pPr>
+    </w:p>
+    <w:p>
+      <w:pPr>
+        <w:spacing w:after="160"/>
+        <w:rPr>
+          <w:rFonts w:ascii="Abadi" w:hAnsi="Abadi"/>
+        </w:rPr>
+      </w:pPr>
+    </w:p>
+    <w:p>
+      <w:pPr>
+        <w:spacing w:after="160"/>
+        <w:rPr>
+          <w:rFonts w:ascii="Abadi" w:hAnsi="Abadi"/>
+        </w:rPr>
+      </w:pPr>
+    </w:p>
+    <w:p>
+      <w:pPr>
+        <w:spacing w:after="160"/>
+        <w:rPr>
+          <w:rFonts w:ascii="Abadi" w:hAnsi="Abadi"/>
+        </w:rPr>
+      </w:pPr>
+    </w:p>
+    <w:p>
+      <w:pPr>
+        <w:spacing w:after="160"/>
+        <w:rPr>
+          <w:rFonts w:ascii="Abadi" w:hAnsi="Abadi"/>
+        </w:rPr>
+      </w:pPr>
+    </w:p>
+    <w:p>
+      <w:pPr>
+        <w:spacing w:after="160"/>
+        <w:rPr>
+          <w:rFonts w:ascii="Abadi" w:hAnsi="Abadi"/>
+        </w:rPr>
+      </w:pPr>
+    </w:p>
+    <w:p>
+      <w:pPr>
+        <w:spacing w:after="160"/>
+        <w:rPr>
+          <w:rFonts w:ascii="Abadi" w:hAnsi="Abadi"/>
+        </w:rPr>
+      </w:pPr>
+    </w:p>
+    <w:p>
+      <w:pPr>
+        <w:pStyle w:val="Heading1"/>
+        <w:spacing w:before="360" w:after="180"/>
+        <w:rPr>
+          <w:rFonts w:ascii="Abadi" w:hAnsi="Abadi"/>
+        </w:rPr>
+      </w:pPr>
+      <w:r>
+        <w:rPr>
+          <w:rFonts w:ascii="Abadi" w:hAnsi="Abadi"/>
+          <w:b/>
+          <w:bCs/>
+          <w:color w:val="145A3A"/>
+        </w:rPr>
+        <w:t>5. Save Progress</w:t>
+      </w:r>
+    </w:p>
+    <w:p>
+      <w:pPr>
+        <w:spacing w:after="160"/>
+        <w:rPr>
+          <w:rFonts w:ascii="Abadi" w:hAnsi="Abadi"/>
+        </w:rPr>
+      </w:pPr>
+      <w:r>
+        <w:rPr>
+          <w:rFonts w:ascii="Abadi" w:hAnsi="Abadi"/>
+        </w:rPr>
+        <w:t>If you want to mark one or more tasks as checked/cleared, tick the checkbox for each completed task, then click Save Progress. This records that the selected task(s) have been checked by you, the Department Head/Clearance Signatory.</w:t>
+      </w:r>
+    </w:p>
+    <w:p>
+      <w:pPr>
+        <w:spacing w:after="160"/>
+        <w:rPr>
+          <w:rFonts w:ascii="Abadi" w:hAnsi="Abadi"/>
+        </w:rPr>
+      </w:pPr>
+    </w:p>
+    <w:p>
+      <w:pPr>
+        <w:spacing w:after="160"/>
+        <w:rPr>
+          <w:rFonts w:ascii="Abadi" w:hAnsi="Abadi"/>
+        </w:rPr>
+      </w:pPr>
     </w:p>
     <w:p>
       <w:pPr>
         <w:spacing w:before="120" w:after="120"/>
         <w:jc w:val="center"/>
-      </w:pPr>
-      <w:r>
-        <w:rPr>
-          <w:noProof/>
-        </w:rPr>
-        <w:lastRenderedPageBreak/>
+        <w:rPr>
+          <w:rFonts w:ascii="Abadi" w:hAnsi="Abadi"/>
+        </w:rPr>
+      </w:pPr>
+      <w:r>
+        <w:rPr>
+          <w:rFonts w:ascii="Abadi" w:hAnsi="Abadi"/>
+        </w:rPr>
         <w:drawing>
-          <wp:inline distT="0" distB="0" distL="0" distR="0" wp14:anchorId="1DC6A173" wp14:editId="682C7431">
-            <wp:extent cx="5334000" cy="3333750"/>
+          <wp:inline distT="0" distB="0" distL="0" distR="0" wp14:anchorId="5524216A" wp14:editId="0B3630DD">
+            <wp:extent cx="4917394" cy="4419600"/>
             <wp:effectExtent l="0" t="0" r="0" b="0"/>
-            <wp:docPr id="6" name="Picture 6"/>
+            <wp:docPr id="1628797917" name="Picture 1"/>
             <wp:cNvGraphicFramePr>
               <a:graphicFrameLocks xmlns:a="http://schemas.openxmlformats.org/drawingml/2006/main" noChangeAspect="1"/>
             </wp:cNvGraphicFramePr>
@@ -865,22 +1743,19 @@
               <a:graphicData uri="http://schemas.openxmlformats.org/drawingml/2006/picture">
                 <pic:pic xmlns:pic="http://schemas.openxmlformats.org/drawingml/2006/picture">
                   <pic:nvPicPr>
-                    <pic:cNvPr id="0" name=""/>
-                    <pic:cNvPicPr>
-                      <a:picLocks noChangeAspect="1" noChangeArrowheads="1"/>
-                    </pic:cNvPicPr>
+                    <pic:cNvPr id="1628797917" name=""/>
+                    <pic:cNvPicPr/>
                   </pic:nvPicPr>
                   <pic:blipFill>
                     <a:blip r:embed="rId11"/>
-                    <a:srcRect/>
                     <a:stretch>
                       <a:fillRect/>
                     </a:stretch>
                   </pic:blipFill>
-                  <pic:spPr bwMode="auto">
+                  <pic:spPr>
                     <a:xfrm>
                       <a:off x="0" y="0"/>
-                      <a:ext cx="5334000" cy="3333750"/>
+                      <a:ext cx="4924717" cy="4426182"/>
                     </a:xfrm>
                     <a:prstGeom prst="rect">
                       <a:avLst/>
@@ -897,77 +1772,59 @@
       <w:pPr>
         <w:spacing w:after="240"/>
         <w:jc w:val="center"/>
-      </w:pPr>
-      <w:r>
-        <w:rPr>
-          <w:i/>
-          <w:iCs/>
-          <w:color w:val="6B7280"/>
-          <w:sz w:val="20"/>
-          <w:szCs w:val="20"/>
-        </w:rPr>
-        <w:t>Figure 5.2 — Progress is being saved.</w:t>
-      </w:r>
-    </w:p>
-    <w:p>
-      <w:pPr>
-        <w:pStyle w:val="Heading1"/>
-        <w:spacing w:before="360" w:after="180"/>
-      </w:pPr>
-      <w:r>
-        <w:rPr>
-          <w:b/>
-          <w:bCs/>
-          <w:color w:val="145A3A"/>
-        </w:rPr>
-        <w:t xml:space="preserve">6. Decline (Place </w:t>
-      </w:r>
-      <w:proofErr w:type="gramStart"/>
-      <w:r>
-        <w:rPr>
-          <w:b/>
-          <w:bCs/>
-          <w:color w:val="145A3A"/>
-        </w:rPr>
-        <w:t>On</w:t>
-      </w:r>
-      <w:proofErr w:type="gramEnd"/>
-      <w:r>
-        <w:rPr>
-          <w:b/>
-          <w:bCs/>
-          <w:color w:val="145A3A"/>
-        </w:rPr>
-        <w:t xml:space="preserve"> Hold)</w:t>
-      </w:r>
-    </w:p>
-    <w:p>
-      <w:pPr>
-        <w:spacing w:after="160"/>
-      </w:pPr>
-      <w:r>
-        <w:t>If you need to hold the checklist for some reason — for example, pending clearance, a personal reason, or any other valid cause — click Decline. You will be required to provide a remark explaining why the checklist is being declined/held before you can confirm.</w:t>
-      </w:r>
-    </w:p>
-    <w:p>
-      <w:pPr>
-        <w:spacing w:after="160"/>
-      </w:pPr>
+        <w:rPr>
+          <w:rFonts w:ascii="Abadi" w:hAnsi="Abadi"/>
+          <w:i/>
+          <w:iCs/>
+          <w:color w:val="6B7280"/>
+          <w:sz w:val="20"/>
+          <w:szCs w:val="20"/>
+        </w:rPr>
+      </w:pPr>
+      <w:r>
+        <w:rPr>
+          <w:rFonts w:ascii="Abadi" w:hAnsi="Abadi"/>
+          <w:i/>
+          <w:iCs/>
+          <w:color w:val="6B7280"/>
+          <w:sz w:val="20"/>
+          <w:szCs w:val="20"/>
+        </w:rPr>
+        <w:t>Figure 5.1 — Tasks checked and ready to save.</w:t>
+      </w:r>
+    </w:p>
+    <w:p>
+      <w:pPr>
+        <w:spacing w:after="160"/>
+        <w:rPr>
+          <w:rFonts w:ascii="Abadi" w:hAnsi="Abadi"/>
+        </w:rPr>
+      </w:pPr>
+      <w:r>
+        <w:rPr>
+          <w:rFonts w:ascii="Abadi" w:hAnsi="Abadi"/>
+        </w:rPr>
+        <w:t>Once saved, a confirmation notification appears and the checklist’s progress is updated immediately — no need to reload the page.</w:t>
+      </w:r>
     </w:p>
     <w:p>
       <w:pPr>
         <w:spacing w:before="120" w:after="120"/>
         <w:jc w:val="center"/>
-      </w:pPr>
-      <w:r>
-        <w:rPr>
-          <w:noProof/>
-        </w:rPr>
+        <w:rPr>
+          <w:rFonts w:ascii="Abadi" w:hAnsi="Abadi"/>
+        </w:rPr>
+      </w:pPr>
+      <w:r>
+        <w:rPr>
+          <w:rFonts w:ascii="Abadi" w:hAnsi="Abadi"/>
+        </w:rPr>
+        <w:lastRenderedPageBreak/>
         <w:drawing>
-          <wp:inline distT="0" distB="0" distL="0" distR="0" wp14:anchorId="0C727D94" wp14:editId="1F486152">
-            <wp:extent cx="5334000" cy="3333750"/>
+          <wp:inline distT="0" distB="0" distL="0" distR="0" wp14:anchorId="4345E154" wp14:editId="5AD353B2">
+            <wp:extent cx="4800600" cy="4312072"/>
             <wp:effectExtent l="0" t="0" r="0" b="0"/>
-            <wp:docPr id="7" name="Picture 7"/>
+            <wp:docPr id="2126466547" name="Picture 1"/>
             <wp:cNvGraphicFramePr>
               <a:graphicFrameLocks xmlns:a="http://schemas.openxmlformats.org/drawingml/2006/main" noChangeAspect="1"/>
             </wp:cNvGraphicFramePr>
@@ -975,22 +1832,19 @@
               <a:graphicData uri="http://schemas.openxmlformats.org/drawingml/2006/picture">
                 <pic:pic xmlns:pic="http://schemas.openxmlformats.org/drawingml/2006/picture">
                   <pic:nvPicPr>
-                    <pic:cNvPr id="0" name=""/>
-                    <pic:cNvPicPr>
-                      <a:picLocks noChangeAspect="1" noChangeArrowheads="1"/>
-                    </pic:cNvPicPr>
+                    <pic:cNvPr id="2126466547" name=""/>
+                    <pic:cNvPicPr/>
                   </pic:nvPicPr>
                   <pic:blipFill>
                     <a:blip r:embed="rId12"/>
-                    <a:srcRect/>
                     <a:stretch>
                       <a:fillRect/>
                     </a:stretch>
                   </pic:blipFill>
-                  <pic:spPr bwMode="auto">
+                  <pic:spPr>
                     <a:xfrm>
                       <a:off x="0" y="0"/>
-                      <a:ext cx="5334000" cy="3333750"/>
+                      <a:ext cx="4805117" cy="4316129"/>
                     </a:xfrm>
                     <a:prstGeom prst="rect">
                       <a:avLst/>
@@ -1007,33 +1861,114 @@
       <w:pPr>
         <w:spacing w:after="240"/>
         <w:jc w:val="center"/>
-      </w:pPr>
-      <w:r>
-        <w:rPr>
-          <w:i/>
-          <w:iCs/>
-          <w:color w:val="6B7280"/>
-          <w:sz w:val="20"/>
-          <w:szCs w:val="20"/>
-        </w:rPr>
-        <w:t>Figure 6.1 — The Decline confirmation prompt, requiring a reason.</w:t>
-      </w:r>
+        <w:rPr>
+          <w:rFonts w:ascii="Abadi" w:hAnsi="Abadi"/>
+          <w:i/>
+          <w:iCs/>
+          <w:color w:val="6B7280"/>
+          <w:sz w:val="20"/>
+          <w:szCs w:val="20"/>
+        </w:rPr>
+      </w:pPr>
+      <w:r>
+        <w:rPr>
+          <w:rFonts w:ascii="Abadi" w:hAnsi="Abadi"/>
+          <w:i/>
+          <w:iCs/>
+          <w:color w:val="6B7280"/>
+          <w:sz w:val="20"/>
+          <w:szCs w:val="20"/>
+        </w:rPr>
+        <w:t>Figure 5.2 — Progress is being saved.</w:t>
+      </w:r>
+    </w:p>
+    <w:p>
+      <w:pPr>
+        <w:spacing w:after="240"/>
+        <w:jc w:val="center"/>
+        <w:rPr>
+          <w:rFonts w:ascii="Abadi" w:hAnsi="Abadi"/>
+        </w:rPr>
+      </w:pPr>
+    </w:p>
+    <w:p>
+      <w:pPr>
+        <w:pStyle w:val="Heading1"/>
+        <w:spacing w:before="360" w:after="180"/>
+        <w:rPr>
+          <w:rFonts w:ascii="Abadi" w:hAnsi="Abadi"/>
+        </w:rPr>
+      </w:pPr>
+      <w:r>
+        <w:rPr>
+          <w:rFonts w:ascii="Abadi" w:hAnsi="Abadi"/>
+          <w:b/>
+          <w:bCs/>
+          <w:color w:val="145A3A"/>
+        </w:rPr>
+        <w:t xml:space="preserve">6. Decline (Place </w:t>
+      </w:r>
+      <w:proofErr w:type="gramStart"/>
+      <w:r>
+        <w:rPr>
+          <w:rFonts w:ascii="Abadi" w:hAnsi="Abadi"/>
+          <w:b/>
+          <w:bCs/>
+          <w:color w:val="145A3A"/>
+        </w:rPr>
+        <w:t>On</w:t>
+      </w:r>
+      <w:proofErr w:type="gramEnd"/>
+      <w:r>
+        <w:rPr>
+          <w:rFonts w:ascii="Abadi" w:hAnsi="Abadi"/>
+          <w:b/>
+          <w:bCs/>
+          <w:color w:val="145A3A"/>
+        </w:rPr>
+        <w:t xml:space="preserve"> Hold)</w:t>
+      </w:r>
+    </w:p>
+    <w:p>
+      <w:pPr>
+        <w:spacing w:after="160"/>
+        <w:rPr>
+          <w:rFonts w:ascii="Abadi" w:hAnsi="Abadi"/>
+        </w:rPr>
+      </w:pPr>
+      <w:r>
+        <w:rPr>
+          <w:rFonts w:ascii="Abadi" w:hAnsi="Abadi"/>
+        </w:rPr>
+        <w:t>If you need to hold the checklist for some reason — for example, pending clearance, a personal reason, or any other valid cause — click Decline. You will be required to provide a remark explaining why the checklist is being declined/held before you can confirm.</w:t>
+      </w:r>
+    </w:p>
+    <w:p>
+      <w:pPr>
+        <w:spacing w:after="160"/>
+        <w:rPr>
+          <w:rFonts w:ascii="Abadi" w:hAnsi="Abadi"/>
+        </w:rPr>
+      </w:pPr>
     </w:p>
     <w:p>
       <w:pPr>
         <w:spacing w:before="120" w:after="120"/>
         <w:jc w:val="center"/>
-      </w:pPr>
-      <w:r>
-        <w:rPr>
-          <w:noProof/>
+        <w:rPr>
+          <w:rFonts w:ascii="Abadi" w:hAnsi="Abadi"/>
+        </w:rPr>
+      </w:pPr>
+      <w:r>
+        <w:rPr>
+          <w:rFonts w:ascii="Abadi" w:hAnsi="Abadi"/>
         </w:rPr>
         <w:lastRenderedPageBreak/>
         <w:drawing>
-          <wp:inline distT="0" distB="0" distL="0" distR="0" wp14:anchorId="36CA565D" wp14:editId="0B6003E2">
-            <wp:extent cx="5334000" cy="3333750"/>
+          <wp:inline distT="0" distB="0" distL="0" distR="0" wp14:anchorId="38CE2AAB" wp14:editId="533C44FE">
+            <wp:extent cx="4389120" cy="3990658"/>
             <wp:effectExtent l="0" t="0" r="0" b="0"/>
-            <wp:docPr id="8" name="Picture 8"/>
+            <wp:docPr id="1061566961" name="Picture 1"/>
             <wp:cNvGraphicFramePr>
               <a:graphicFrameLocks xmlns:a="http://schemas.openxmlformats.org/drawingml/2006/main" noChangeAspect="1"/>
             </wp:cNvGraphicFramePr>
@@ -1041,22 +1976,19 @@
               <a:graphicData uri="http://schemas.openxmlformats.org/drawingml/2006/picture">
                 <pic:pic xmlns:pic="http://schemas.openxmlformats.org/drawingml/2006/picture">
                   <pic:nvPicPr>
-                    <pic:cNvPr id="0" name=""/>
-                    <pic:cNvPicPr>
-                      <a:picLocks noChangeAspect="1" noChangeArrowheads="1"/>
-                    </pic:cNvPicPr>
+                    <pic:cNvPr id="1061566961" name=""/>
+                    <pic:cNvPicPr/>
                   </pic:nvPicPr>
                   <pic:blipFill>
                     <a:blip r:embed="rId13"/>
-                    <a:srcRect/>
                     <a:stretch>
                       <a:fillRect/>
                     </a:stretch>
                   </pic:blipFill>
-                  <pic:spPr bwMode="auto">
+                  <pic:spPr>
                     <a:xfrm>
                       <a:off x="0" y="0"/>
-                      <a:ext cx="5334000" cy="3333750"/>
+                      <a:ext cx="4406470" cy="4006433"/>
                     </a:xfrm>
                     <a:prstGeom prst="rect">
                       <a:avLst/>
@@ -1073,45 +2005,39 @@
       <w:pPr>
         <w:spacing w:after="240"/>
         <w:jc w:val="center"/>
-      </w:pPr>
-      <w:r>
-        <w:rPr>
-          <w:i/>
-          <w:iCs/>
-          <w:color w:val="6B7280"/>
-          <w:sz w:val="20"/>
-          <w:szCs w:val="20"/>
-        </w:rPr>
-        <w:t>Figure 6.2 — Reason entered, ready to confirm with “Yes, Decline”.</w:t>
-      </w:r>
-    </w:p>
-    <w:p>
-      <w:pPr>
-        <w:spacing w:after="160"/>
-      </w:pPr>
-      <w:r>
-        <w:t>Once confirmed, the checklist is placed On Hold. All tasks, approval, and further decline actions are disabled until the hold is removed. The reason you provided is recorded and shown on the checklist.</w:t>
-      </w:r>
-    </w:p>
-    <w:p>
-      <w:pPr>
-        <w:spacing w:after="160"/>
-      </w:pPr>
+        <w:rPr>
+          <w:rFonts w:ascii="Abadi" w:hAnsi="Abadi"/>
+        </w:rPr>
+      </w:pPr>
+      <w:r>
+        <w:rPr>
+          <w:rFonts w:ascii="Abadi" w:hAnsi="Abadi"/>
+          <w:i/>
+          <w:iCs/>
+          <w:color w:val="6B7280"/>
+          <w:sz w:val="20"/>
+          <w:szCs w:val="20"/>
+        </w:rPr>
+        <w:t>Figure 6.1 — The Decline confirmation prompt, requiring a reason.</w:t>
+      </w:r>
     </w:p>
     <w:p>
       <w:pPr>
         <w:spacing w:before="120" w:after="120"/>
         <w:jc w:val="center"/>
-      </w:pPr>
-      <w:r>
-        <w:rPr>
-          <w:noProof/>
+        <w:rPr>
+          <w:rFonts w:ascii="Abadi" w:hAnsi="Abadi"/>
+        </w:rPr>
+      </w:pPr>
+      <w:r>
+        <w:rPr>
+          <w:rFonts w:ascii="Abadi" w:hAnsi="Abadi"/>
         </w:rPr>
         <w:drawing>
-          <wp:inline distT="0" distB="0" distL="0" distR="0" wp14:anchorId="7D819D42" wp14:editId="707AFAF7">
-            <wp:extent cx="5334000" cy="3333750"/>
+          <wp:inline distT="0" distB="0" distL="0" distR="0" wp14:anchorId="541E818F" wp14:editId="5D1FAFB4">
+            <wp:extent cx="4422964" cy="4008120"/>
             <wp:effectExtent l="0" t="0" r="0" b="0"/>
-            <wp:docPr id="9" name="Picture 9"/>
+            <wp:docPr id="739904324" name="Picture 1"/>
             <wp:cNvGraphicFramePr>
               <a:graphicFrameLocks xmlns:a="http://schemas.openxmlformats.org/drawingml/2006/main" noChangeAspect="1"/>
             </wp:cNvGraphicFramePr>
@@ -1119,22 +2045,19 @@
               <a:graphicData uri="http://schemas.openxmlformats.org/drawingml/2006/picture">
                 <pic:pic xmlns:pic="http://schemas.openxmlformats.org/drawingml/2006/picture">
                   <pic:nvPicPr>
-                    <pic:cNvPr id="0" name=""/>
-                    <pic:cNvPicPr>
-                      <a:picLocks noChangeAspect="1" noChangeArrowheads="1"/>
-                    </pic:cNvPicPr>
+                    <pic:cNvPr id="739904324" name=""/>
+                    <pic:cNvPicPr/>
                   </pic:nvPicPr>
                   <pic:blipFill>
                     <a:blip r:embed="rId14"/>
-                    <a:srcRect/>
                     <a:stretch>
                       <a:fillRect/>
                     </a:stretch>
                   </pic:blipFill>
-                  <pic:spPr bwMode="auto">
+                  <pic:spPr>
                     <a:xfrm>
                       <a:off x="0" y="0"/>
-                      <a:ext cx="5334000" cy="3333750"/>
+                      <a:ext cx="4435197" cy="4019205"/>
                     </a:xfrm>
                     <a:prstGeom prst="rect">
                       <a:avLst/>
@@ -1152,93 +2075,61 @@
         <w:spacing w:after="240"/>
         <w:jc w:val="center"/>
         <w:rPr>
-          <w:i/>
-          <w:iCs/>
-          <w:color w:val="6B7280"/>
-          <w:sz w:val="20"/>
-          <w:szCs w:val="20"/>
-        </w:rPr>
-      </w:pPr>
-      <w:r>
-        <w:rPr>
-          <w:i/>
-          <w:iCs/>
-          <w:color w:val="6B7280"/>
-          <w:sz w:val="20"/>
-          <w:szCs w:val="20"/>
-        </w:rPr>
-        <w:t>Figure 6.3 — The checklist is now On Hold, with the recorded reason displayed.</w:t>
-      </w:r>
-    </w:p>
-    <w:p>
-      <w:pPr>
-        <w:spacing w:after="240"/>
-        <w:jc w:val="center"/>
-        <w:rPr>
-          <w:i/>
-          <w:iCs/>
-          <w:color w:val="6B7280"/>
-          <w:sz w:val="20"/>
-          <w:szCs w:val="20"/>
-        </w:rPr>
-      </w:pPr>
-    </w:p>
-    <w:p>
-      <w:pPr>
-        <w:spacing w:after="240"/>
-        <w:jc w:val="center"/>
-      </w:pPr>
-    </w:p>
-    <w:p>
-      <w:pPr>
-        <w:pStyle w:val="Heading1"/>
-        <w:spacing w:before="360" w:after="180"/>
-      </w:pPr>
-      <w:r>
-        <w:rPr>
-          <w:b/>
-          <w:bCs/>
-          <w:color w:val="145A3A"/>
+          <w:rFonts w:ascii="Abadi" w:hAnsi="Abadi"/>
+        </w:rPr>
+      </w:pPr>
+      <w:r>
+        <w:rPr>
+          <w:rFonts w:ascii="Abadi" w:hAnsi="Abadi"/>
+          <w:i/>
+          <w:iCs/>
+          <w:color w:val="6B7280"/>
+          <w:sz w:val="20"/>
+          <w:szCs w:val="20"/>
+        </w:rPr>
+        <w:t>Figure 6.2 — Reason entered, ready to confirm with “Yes, Decline”.</w:t>
+      </w:r>
+    </w:p>
+    <w:p>
+      <w:pPr>
+        <w:spacing w:after="160"/>
+        <w:rPr>
+          <w:rFonts w:ascii="Abadi" w:hAnsi="Abadi"/>
+        </w:rPr>
+      </w:pPr>
+      <w:r>
+        <w:rPr>
+          <w:rFonts w:ascii="Abadi" w:hAnsi="Abadi"/>
         </w:rPr>
         <w:lastRenderedPageBreak/>
-        <w:t>7. Remove On Hold</w:t>
-      </w:r>
-    </w:p>
-    <w:p>
-      <w:pPr>
-        <w:spacing w:after="160"/>
-      </w:pPr>
-      <w:r>
-        <w:t xml:space="preserve">When you are ready to resume processing a checklist you previously placed on hold, click Remove </w:t>
-      </w:r>
-      <w:proofErr w:type="gramStart"/>
-      <w:r>
-        <w:t>On</w:t>
-      </w:r>
-      <w:proofErr w:type="gramEnd"/>
-      <w:r>
-        <w:t xml:space="preserve"> Hold. This changes the checklist’s status from On Hold back to in progress, which means you can now continue working on and eventually approve the checklist. You are required to provide a remark when removing the hold as well.</w:t>
-      </w:r>
-    </w:p>
-    <w:p>
-      <w:pPr>
-        <w:spacing w:after="160"/>
+        <w:t>Once confirmed, the checklist is placed On Hold. All tasks, approval, and further decline actions are disabled until the hold is removed. The reason you provided is recorded and shown on the checklist.</w:t>
+      </w:r>
+    </w:p>
+    <w:p>
+      <w:pPr>
+        <w:spacing w:after="160"/>
+        <w:rPr>
+          <w:rFonts w:ascii="Abadi" w:hAnsi="Abadi"/>
+        </w:rPr>
       </w:pPr>
     </w:p>
     <w:p>
       <w:pPr>
         <w:spacing w:before="120" w:after="120"/>
         <w:jc w:val="center"/>
-      </w:pPr>
-      <w:r>
-        <w:rPr>
-          <w:noProof/>
+        <w:rPr>
+          <w:rFonts w:ascii="Abadi" w:hAnsi="Abadi"/>
+        </w:rPr>
+      </w:pPr>
+      <w:r>
+        <w:rPr>
+          <w:rFonts w:ascii="Abadi" w:hAnsi="Abadi"/>
         </w:rPr>
         <w:drawing>
-          <wp:inline distT="0" distB="0" distL="0" distR="0" wp14:anchorId="38FAB7AA" wp14:editId="0564B7D3">
-            <wp:extent cx="5334000" cy="3333750"/>
+          <wp:inline distT="0" distB="0" distL="0" distR="0" wp14:anchorId="63FA4B95" wp14:editId="5BD8AFF4">
+            <wp:extent cx="4596624" cy="4122420"/>
             <wp:effectExtent l="0" t="0" r="0" b="0"/>
-            <wp:docPr id="10" name="Picture 10"/>
+            <wp:docPr id="1733470744" name="Picture 1"/>
             <wp:cNvGraphicFramePr>
               <a:graphicFrameLocks xmlns:a="http://schemas.openxmlformats.org/drawingml/2006/main" noChangeAspect="1"/>
             </wp:cNvGraphicFramePr>
@@ -1246,22 +2137,19 @@
               <a:graphicData uri="http://schemas.openxmlformats.org/drawingml/2006/picture">
                 <pic:pic xmlns:pic="http://schemas.openxmlformats.org/drawingml/2006/picture">
                   <pic:nvPicPr>
-                    <pic:cNvPr id="0" name=""/>
-                    <pic:cNvPicPr>
-                      <a:picLocks noChangeAspect="1" noChangeArrowheads="1"/>
-                    </pic:cNvPicPr>
+                    <pic:cNvPr id="1733470744" name=""/>
+                    <pic:cNvPicPr/>
                   </pic:nvPicPr>
                   <pic:blipFill>
                     <a:blip r:embed="rId15"/>
-                    <a:srcRect/>
                     <a:stretch>
                       <a:fillRect/>
                     </a:stretch>
                   </pic:blipFill>
-                  <pic:spPr bwMode="auto">
+                  <pic:spPr>
                     <a:xfrm>
                       <a:off x="0" y="0"/>
-                      <a:ext cx="5334000" cy="3333750"/>
+                      <a:ext cx="4601772" cy="4127037"/>
                     </a:xfrm>
                     <a:prstGeom prst="rect">
                       <a:avLst/>
@@ -1278,32 +2166,122 @@
       <w:pPr>
         <w:spacing w:after="240"/>
         <w:jc w:val="center"/>
-      </w:pPr>
-      <w:r>
-        <w:rPr>
-          <w:i/>
-          <w:iCs/>
-          <w:color w:val="6B7280"/>
-          <w:sz w:val="20"/>
-          <w:szCs w:val="20"/>
-        </w:rPr>
-        <w:t>Figure 7.1 — Confirming the removal of the hold, with a remark.</w:t>
-      </w:r>
+        <w:rPr>
+          <w:rFonts w:ascii="Abadi" w:hAnsi="Abadi"/>
+          <w:i/>
+          <w:iCs/>
+          <w:color w:val="6B7280"/>
+          <w:sz w:val="20"/>
+          <w:szCs w:val="20"/>
+        </w:rPr>
+      </w:pPr>
+      <w:r>
+        <w:rPr>
+          <w:rFonts w:ascii="Abadi" w:hAnsi="Abadi"/>
+          <w:i/>
+          <w:iCs/>
+          <w:color w:val="6B7280"/>
+          <w:sz w:val="20"/>
+          <w:szCs w:val="20"/>
+        </w:rPr>
+        <w:t>Figure 6.3 — The checklist is now On Hold, with the recorded reason displayed.</w:t>
+      </w:r>
+    </w:p>
+    <w:p>
+      <w:pPr>
+        <w:spacing w:after="240"/>
+        <w:jc w:val="center"/>
+        <w:rPr>
+          <w:rFonts w:ascii="Abadi" w:hAnsi="Abadi"/>
+          <w:i/>
+          <w:iCs/>
+          <w:color w:val="6B7280"/>
+          <w:sz w:val="20"/>
+          <w:szCs w:val="20"/>
+        </w:rPr>
+      </w:pPr>
+    </w:p>
+    <w:p>
+      <w:pPr>
+        <w:spacing w:after="240"/>
+        <w:jc w:val="center"/>
+        <w:rPr>
+          <w:rFonts w:ascii="Abadi" w:hAnsi="Abadi"/>
+        </w:rPr>
+      </w:pPr>
+    </w:p>
+    <w:p>
+      <w:pPr>
+        <w:pStyle w:val="Heading1"/>
+        <w:spacing w:before="360" w:after="180"/>
+        <w:rPr>
+          <w:rFonts w:ascii="Abadi" w:hAnsi="Abadi"/>
+        </w:rPr>
+      </w:pPr>
+      <w:r>
+        <w:rPr>
+          <w:rFonts w:ascii="Abadi" w:hAnsi="Abadi"/>
+          <w:b/>
+          <w:bCs/>
+          <w:color w:val="145A3A"/>
+        </w:rPr>
+        <w:t>7. Remove On Hold</w:t>
+      </w:r>
+    </w:p>
+    <w:p>
+      <w:pPr>
+        <w:spacing w:after="160"/>
+        <w:rPr>
+          <w:rFonts w:ascii="Abadi" w:hAnsi="Abadi"/>
+        </w:rPr>
+      </w:pPr>
+      <w:r>
+        <w:rPr>
+          <w:rFonts w:ascii="Abadi" w:hAnsi="Abadi"/>
+        </w:rPr>
+        <w:t xml:space="preserve">When you are ready to resume processing a checklist you previously placed on hold, click Remove </w:t>
+      </w:r>
+      <w:proofErr w:type="gramStart"/>
+      <w:r>
+        <w:rPr>
+          <w:rFonts w:ascii="Abadi" w:hAnsi="Abadi"/>
+        </w:rPr>
+        <w:t>On</w:t>
+      </w:r>
+      <w:proofErr w:type="gramEnd"/>
+      <w:r>
+        <w:rPr>
+          <w:rFonts w:ascii="Abadi" w:hAnsi="Abadi"/>
+        </w:rPr>
+        <w:t xml:space="preserve"> Hold. This changes the checklist’s status from On Hold back to in progress, which means you can now continue working on and eventually approve the checklist. You are required to provide a remark when removing the hold as well.</w:t>
+      </w:r>
+    </w:p>
+    <w:p>
+      <w:pPr>
+        <w:spacing w:after="160"/>
+        <w:rPr>
+          <w:rFonts w:ascii="Abadi" w:hAnsi="Abadi"/>
+        </w:rPr>
+      </w:pPr>
     </w:p>
     <w:p>
       <w:pPr>
         <w:spacing w:before="120" w:after="120"/>
         <w:jc w:val="center"/>
-      </w:pPr>
-      <w:r>
-        <w:rPr>
-          <w:noProof/>
-        </w:rPr>
+        <w:rPr>
+          <w:rFonts w:ascii="Abadi" w:hAnsi="Abadi"/>
+        </w:rPr>
+      </w:pPr>
+      <w:r>
+        <w:rPr>
+          <w:rFonts w:ascii="Abadi" w:hAnsi="Abadi"/>
+        </w:rPr>
+        <w:lastRenderedPageBreak/>
         <w:drawing>
-          <wp:inline distT="0" distB="0" distL="0" distR="0" wp14:anchorId="03ECBC93" wp14:editId="2C0AF93E">
-            <wp:extent cx="5334000" cy="3333750"/>
-            <wp:effectExtent l="0" t="0" r="0" b="0"/>
-            <wp:docPr id="11" name="Picture 11"/>
+          <wp:inline distT="0" distB="0" distL="0" distR="0" wp14:anchorId="45976391" wp14:editId="0BC560A0">
+            <wp:extent cx="4393402" cy="3939540"/>
+            <wp:effectExtent l="0" t="0" r="7620" b="3810"/>
+            <wp:docPr id="1078832462" name="Picture 1"/>
             <wp:cNvGraphicFramePr>
               <a:graphicFrameLocks xmlns:a="http://schemas.openxmlformats.org/drawingml/2006/main" noChangeAspect="1"/>
             </wp:cNvGraphicFramePr>
@@ -1311,22 +2289,19 @@
               <a:graphicData uri="http://schemas.openxmlformats.org/drawingml/2006/picture">
                 <pic:pic xmlns:pic="http://schemas.openxmlformats.org/drawingml/2006/picture">
                   <pic:nvPicPr>
-                    <pic:cNvPr id="0" name=""/>
-                    <pic:cNvPicPr>
-                      <a:picLocks noChangeAspect="1" noChangeArrowheads="1"/>
-                    </pic:cNvPicPr>
+                    <pic:cNvPr id="1078832462" name=""/>
+                    <pic:cNvPicPr/>
                   </pic:nvPicPr>
                   <pic:blipFill>
                     <a:blip r:embed="rId16"/>
-                    <a:srcRect/>
                     <a:stretch>
                       <a:fillRect/>
                     </a:stretch>
                   </pic:blipFill>
-                  <pic:spPr bwMode="auto">
+                  <pic:spPr>
                     <a:xfrm>
                       <a:off x="0" y="0"/>
-                      <a:ext cx="5334000" cy="3333750"/>
+                      <a:ext cx="4403549" cy="3948639"/>
                     </a:xfrm>
                     <a:prstGeom prst="rect">
                       <a:avLst/>
@@ -1343,60 +2318,39 @@
       <w:pPr>
         <w:spacing w:after="240"/>
         <w:jc w:val="center"/>
-      </w:pPr>
-      <w:r>
-        <w:rPr>
-          <w:i/>
-          <w:iCs/>
-          <w:color w:val="6B7280"/>
-          <w:sz w:val="20"/>
-          <w:szCs w:val="20"/>
-        </w:rPr>
-        <w:t>Figure 7.2 — Hold successfully removed; the checklist is available for review again.</w:t>
-      </w:r>
-    </w:p>
-    <w:p>
-      <w:pPr>
-        <w:pStyle w:val="Heading1"/>
-        <w:spacing w:before="360" w:after="180"/>
-      </w:pPr>
-      <w:r>
-        <w:rPr>
-          <w:b/>
-          <w:bCs/>
-          <w:color w:val="145A3A"/>
-        </w:rPr>
-        <w:lastRenderedPageBreak/>
-        <w:t>8. Approve</w:t>
-      </w:r>
-    </w:p>
-    <w:p>
-      <w:pPr>
-        <w:spacing w:after="160"/>
-      </w:pPr>
-      <w:r>
-        <w:t>The Approve button only becomes available once every task on the checklist has been checked/cleared — whether by the task assignee(s) themselves or by you directly. Once all items are checked, review the details, then click Approve to submit your final approval for this checklist.</w:t>
-      </w:r>
-    </w:p>
-    <w:p>
-      <w:pPr>
-        <w:spacing w:after="160"/>
-      </w:pPr>
+        <w:rPr>
+          <w:rFonts w:ascii="Abadi" w:hAnsi="Abadi"/>
+        </w:rPr>
+      </w:pPr>
+      <w:r>
+        <w:rPr>
+          <w:rFonts w:ascii="Abadi" w:hAnsi="Abadi"/>
+          <w:i/>
+          <w:iCs/>
+          <w:color w:val="6B7280"/>
+          <w:sz w:val="20"/>
+          <w:szCs w:val="20"/>
+        </w:rPr>
+        <w:t>Figure 7.1 — Confirming the removal of the hold, with a remark.</w:t>
+      </w:r>
     </w:p>
     <w:p>
       <w:pPr>
         <w:spacing w:before="120" w:after="120"/>
         <w:jc w:val="center"/>
-      </w:pPr>
-      <w:r>
-        <w:rPr>
-          <w:noProof/>
+        <w:rPr>
+          <w:rFonts w:ascii="Abadi" w:hAnsi="Abadi"/>
+        </w:rPr>
+      </w:pPr>
+      <w:r>
+        <w:rPr>
+          <w:rFonts w:ascii="Abadi" w:hAnsi="Abadi"/>
         </w:rPr>
         <w:drawing>
-          <wp:inline distT="0" distB="0" distL="0" distR="0" wp14:anchorId="3C088EF3" wp14:editId="2F60C86F">
-            <wp:extent cx="5334000" cy="3333750"/>
-            <wp:effectExtent l="0" t="0" r="0" b="0"/>
-            <wp:docPr id="12" name="Picture 12"/>
+          <wp:inline distT="0" distB="0" distL="0" distR="0" wp14:anchorId="6BE76CEC" wp14:editId="523DB85E">
+            <wp:extent cx="4404360" cy="3980281"/>
+            <wp:effectExtent l="0" t="0" r="0" b="1270"/>
+            <wp:docPr id="63991114" name="Picture 1"/>
             <wp:cNvGraphicFramePr>
               <a:graphicFrameLocks xmlns:a="http://schemas.openxmlformats.org/drawingml/2006/main" noChangeAspect="1"/>
             </wp:cNvGraphicFramePr>
@@ -1404,22 +2358,19 @@
               <a:graphicData uri="http://schemas.openxmlformats.org/drawingml/2006/picture">
                 <pic:pic xmlns:pic="http://schemas.openxmlformats.org/drawingml/2006/picture">
                   <pic:nvPicPr>
-                    <pic:cNvPr id="0" name=""/>
-                    <pic:cNvPicPr>
-                      <a:picLocks noChangeAspect="1" noChangeArrowheads="1"/>
-                    </pic:cNvPicPr>
+                    <pic:cNvPr id="63991114" name=""/>
+                    <pic:cNvPicPr/>
                   </pic:nvPicPr>
                   <pic:blipFill>
                     <a:blip r:embed="rId17"/>
-                    <a:srcRect/>
                     <a:stretch>
                       <a:fillRect/>
                     </a:stretch>
                   </pic:blipFill>
-                  <pic:spPr bwMode="auto">
+                  <pic:spPr>
                     <a:xfrm>
                       <a:off x="0" y="0"/>
-                      <a:ext cx="5334000" cy="3333750"/>
+                      <a:ext cx="4417772" cy="3992401"/>
                     </a:xfrm>
                     <a:prstGeom prst="rect">
                       <a:avLst/>
@@ -1436,32 +2387,80 @@
       <w:pPr>
         <w:spacing w:after="240"/>
         <w:jc w:val="center"/>
-      </w:pPr>
-      <w:r>
-        <w:rPr>
-          <w:i/>
-          <w:iCs/>
-          <w:color w:val="6B7280"/>
-          <w:sz w:val="20"/>
-          <w:szCs w:val="20"/>
-        </w:rPr>
-        <w:t>Figure 8.1 — All items checked; Approve is now enabled.</w:t>
-      </w:r>
+        <w:rPr>
+          <w:rFonts w:ascii="Abadi" w:hAnsi="Abadi"/>
+        </w:rPr>
+      </w:pPr>
+      <w:r>
+        <w:rPr>
+          <w:rFonts w:ascii="Abadi" w:hAnsi="Abadi"/>
+          <w:i/>
+          <w:iCs/>
+          <w:color w:val="6B7280"/>
+          <w:sz w:val="20"/>
+          <w:szCs w:val="20"/>
+        </w:rPr>
+        <w:t>Figure 7.2 — Hold successfully removed; the checklist is available for review again.</w:t>
+      </w:r>
+    </w:p>
+    <w:p>
+      <w:pPr>
+        <w:pStyle w:val="Heading1"/>
+        <w:spacing w:before="360" w:after="180"/>
+        <w:rPr>
+          <w:rFonts w:ascii="Abadi" w:hAnsi="Abadi"/>
+        </w:rPr>
+      </w:pPr>
+      <w:r>
+        <w:rPr>
+          <w:rFonts w:ascii="Abadi" w:hAnsi="Abadi"/>
+          <w:b/>
+          <w:bCs/>
+          <w:color w:val="145A3A"/>
+        </w:rPr>
+        <w:lastRenderedPageBreak/>
+        <w:t>8. Approve</w:t>
+      </w:r>
+    </w:p>
+    <w:p>
+      <w:pPr>
+        <w:spacing w:after="160"/>
+        <w:rPr>
+          <w:rFonts w:ascii="Abadi" w:hAnsi="Abadi"/>
+        </w:rPr>
+      </w:pPr>
+      <w:r>
+        <w:rPr>
+          <w:rFonts w:ascii="Abadi" w:hAnsi="Abadi"/>
+        </w:rPr>
+        <w:t>The Approve button only becomes available once every task on the checklist has been checked/cleared — whether by the task assignee(s) themselves or by you directly. Once all items are checked, review the details, then click Approve to submit your final approval for this checklist.</w:t>
+      </w:r>
+    </w:p>
+    <w:p>
+      <w:pPr>
+        <w:spacing w:after="160"/>
+        <w:rPr>
+          <w:rFonts w:ascii="Abadi" w:hAnsi="Abadi"/>
+        </w:rPr>
+      </w:pPr>
     </w:p>
     <w:p>
       <w:pPr>
         <w:spacing w:before="120" w:after="120"/>
         <w:jc w:val="center"/>
-      </w:pPr>
-      <w:r>
-        <w:rPr>
-          <w:noProof/>
+        <w:rPr>
+          <w:rFonts w:ascii="Abadi" w:hAnsi="Abadi"/>
+        </w:rPr>
+      </w:pPr>
+      <w:r>
+        <w:rPr>
+          <w:rFonts w:ascii="Abadi" w:hAnsi="Abadi"/>
         </w:rPr>
         <w:drawing>
-          <wp:inline distT="0" distB="0" distL="0" distR="0" wp14:anchorId="2EF62118" wp14:editId="3360563C">
-            <wp:extent cx="5334000" cy="3333750"/>
+          <wp:inline distT="0" distB="0" distL="0" distR="0" wp14:anchorId="7B548922" wp14:editId="6E48B3AA">
+            <wp:extent cx="3876398" cy="3512820"/>
             <wp:effectExtent l="0" t="0" r="0" b="0"/>
-            <wp:docPr id="13" name="Picture 13"/>
+            <wp:docPr id="1027105735" name="Picture 1"/>
             <wp:cNvGraphicFramePr>
               <a:graphicFrameLocks xmlns:a="http://schemas.openxmlformats.org/drawingml/2006/main" noChangeAspect="1"/>
             </wp:cNvGraphicFramePr>
@@ -1469,22 +2468,19 @@
               <a:graphicData uri="http://schemas.openxmlformats.org/drawingml/2006/picture">
                 <pic:pic xmlns:pic="http://schemas.openxmlformats.org/drawingml/2006/picture">
                   <pic:nvPicPr>
-                    <pic:cNvPr id="0" name=""/>
-                    <pic:cNvPicPr>
-                      <a:picLocks noChangeAspect="1" noChangeArrowheads="1"/>
-                    </pic:cNvPicPr>
+                    <pic:cNvPr id="1027105735" name=""/>
+                    <pic:cNvPicPr/>
                   </pic:nvPicPr>
                   <pic:blipFill>
                     <a:blip r:embed="rId18"/>
-                    <a:srcRect/>
                     <a:stretch>
                       <a:fillRect/>
                     </a:stretch>
                   </pic:blipFill>
-                  <pic:spPr bwMode="auto">
+                  <pic:spPr>
                     <a:xfrm>
                       <a:off x="0" y="0"/>
-                      <a:ext cx="5334000" cy="3333750"/>
+                      <a:ext cx="3902867" cy="3536807"/>
                     </a:xfrm>
                     <a:prstGeom prst="rect">
                       <a:avLst/>
@@ -1501,95 +2497,39 @@
       <w:pPr>
         <w:spacing w:after="240"/>
         <w:jc w:val="center"/>
-      </w:pPr>
-      <w:r>
-        <w:rPr>
-          <w:i/>
-          <w:iCs/>
-          <w:color w:val="6B7280"/>
-          <w:sz w:val="20"/>
-          <w:szCs w:val="20"/>
-        </w:rPr>
-        <w:t>Figure 8.2 — Submitting the approval.</w:t>
-      </w:r>
-    </w:p>
-    <w:p>
-      <w:pPr>
-        <w:pStyle w:val="Heading1"/>
-        <w:spacing w:before="360" w:after="180"/>
-        <w:rPr>
-          <w:b/>
-          <w:bCs/>
-          <w:color w:val="145A3A"/>
-        </w:rPr>
-      </w:pPr>
-      <w:r>
-        <w:rPr>
-          <w:b/>
-          <w:bCs/>
-          <w:color w:val="145A3A"/>
-        </w:rPr>
-        <w:lastRenderedPageBreak/>
-        <w:t>9. Notifications</w:t>
-      </w:r>
-    </w:p>
-    <w:p/>
-    <w:p>
-      <w:pPr>
-        <w:spacing w:after="160"/>
-      </w:pPr>
-      <w:r>
-        <w:t xml:space="preserve">Upon successfully Saving Progress, Declining, </w:t>
-      </w:r>
-      <w:proofErr w:type="gramStart"/>
-      <w:r>
-        <w:t>Removing</w:t>
-      </w:r>
-      <w:proofErr w:type="gramEnd"/>
-      <w:r>
-        <w:t xml:space="preserve"> a Hold, or Approving a checklist, the system automatically generates a confirmation </w:t>
-      </w:r>
-      <w:proofErr w:type="gramStart"/>
-      <w:r>
-        <w:t>notification</w:t>
-      </w:r>
-      <w:proofErr w:type="gramEnd"/>
-      <w:r>
-        <w:t xml:space="preserve"> so you always know your action was recorded.</w:t>
-      </w:r>
-    </w:p>
-    <w:p>
-      <w:pPr>
-        <w:spacing w:after="160"/>
-      </w:pPr>
-      <w:r>
-        <w:t>In addition, once every task on a checklist assigned to you has been completed by the task assignee(s), the system automatically notifies you — both as an in-app notification (via the bell icon) and by email — that the checklist is now ready for your review and final approval.</w:t>
-      </w:r>
-    </w:p>
-    <w:p>
-      <w:pPr>
-        <w:spacing w:after="160"/>
-      </w:pPr>
-    </w:p>
-    <w:p>
-      <w:pPr>
-        <w:spacing w:after="160"/>
-      </w:pPr>
+        <w:rPr>
+          <w:rFonts w:ascii="Abadi" w:hAnsi="Abadi"/>
+        </w:rPr>
+      </w:pPr>
+      <w:r>
+        <w:rPr>
+          <w:rFonts w:ascii="Abadi" w:hAnsi="Abadi"/>
+          <w:i/>
+          <w:iCs/>
+          <w:color w:val="6B7280"/>
+          <w:sz w:val="20"/>
+          <w:szCs w:val="20"/>
+        </w:rPr>
+        <w:t>Figure 8.1 — All items checked; Approve is now enabled.</w:t>
+      </w:r>
     </w:p>
     <w:p>
       <w:pPr>
         <w:spacing w:before="120" w:after="120"/>
         <w:jc w:val="center"/>
-      </w:pPr>
-      <w:r>
-        <w:rPr>
-          <w:noProof/>
+        <w:rPr>
+          <w:rFonts w:ascii="Abadi" w:hAnsi="Abadi"/>
+        </w:rPr>
+      </w:pPr>
+      <w:r>
+        <w:rPr>
+          <w:rFonts w:ascii="Abadi" w:hAnsi="Abadi"/>
         </w:rPr>
         <w:drawing>
-          <wp:inline distT="0" distB="0" distL="0" distR="0" wp14:anchorId="11D8FE56" wp14:editId="4CA1E81B">
-            <wp:extent cx="5524500" cy="3457575"/>
-            <wp:effectExtent l="0" t="0" r="0" b="0"/>
-            <wp:docPr id="14" name="Picture 14"/>
+          <wp:inline distT="0" distB="0" distL="0" distR="0" wp14:anchorId="03D9120F" wp14:editId="2A4DAA5D">
+            <wp:extent cx="3863340" cy="3500985"/>
+            <wp:effectExtent l="0" t="0" r="3810" b="4445"/>
+            <wp:docPr id="1791237237" name="Picture 1"/>
             <wp:cNvGraphicFramePr>
               <a:graphicFrameLocks xmlns:a="http://schemas.openxmlformats.org/drawingml/2006/main" noChangeAspect="1"/>
             </wp:cNvGraphicFramePr>
@@ -1597,22 +2537,19 @@
               <a:graphicData uri="http://schemas.openxmlformats.org/drawingml/2006/picture">
                 <pic:pic xmlns:pic="http://schemas.openxmlformats.org/drawingml/2006/picture">
                   <pic:nvPicPr>
-                    <pic:cNvPr id="0" name=""/>
-                    <pic:cNvPicPr>
-                      <a:picLocks noChangeAspect="1" noChangeArrowheads="1"/>
-                    </pic:cNvPicPr>
+                    <pic:cNvPr id="1791237237" name=""/>
+                    <pic:cNvPicPr/>
                   </pic:nvPicPr>
                   <pic:blipFill>
                     <a:blip r:embed="rId19"/>
-                    <a:srcRect/>
                     <a:stretch>
                       <a:fillRect/>
                     </a:stretch>
                   </pic:blipFill>
-                  <pic:spPr bwMode="auto">
+                  <pic:spPr>
                     <a:xfrm>
                       <a:off x="0" y="0"/>
-                      <a:ext cx="5524500" cy="3457575"/>
+                      <a:ext cx="3877295" cy="3513631"/>
                     </a:xfrm>
                     <a:prstGeom prst="rect">
                       <a:avLst/>
@@ -1630,67 +2567,140 @@
         <w:spacing w:after="240"/>
         <w:jc w:val="center"/>
         <w:rPr>
-          <w:i/>
-          <w:iCs/>
-          <w:color w:val="6B7280"/>
-          <w:sz w:val="20"/>
-          <w:szCs w:val="20"/>
-        </w:rPr>
-      </w:pPr>
-      <w:r>
-        <w:rPr>
-          <w:i/>
-          <w:iCs/>
-          <w:color w:val="6B7280"/>
-          <w:sz w:val="20"/>
-          <w:szCs w:val="20"/>
-        </w:rPr>
-        <w:t>Figure 9.1 — An in-app “Ready for Your Approval” notification in the bell dropdown.</w:t>
-      </w:r>
-    </w:p>
-    <w:p>
-      <w:pPr>
-        <w:spacing w:after="240"/>
-        <w:jc w:val="center"/>
-      </w:pPr>
+          <w:rFonts w:ascii="Abadi" w:hAnsi="Abadi"/>
+        </w:rPr>
+      </w:pPr>
+      <w:r>
+        <w:rPr>
+          <w:rFonts w:ascii="Abadi" w:hAnsi="Abadi"/>
+          <w:i/>
+          <w:iCs/>
+          <w:color w:val="6B7280"/>
+          <w:sz w:val="20"/>
+          <w:szCs w:val="20"/>
+        </w:rPr>
+        <w:lastRenderedPageBreak/>
+        <w:t>Figure 8.2 — Submitting the approval.</w:t>
+      </w:r>
     </w:p>
     <w:p>
       <w:pPr>
         <w:pStyle w:val="Heading1"/>
         <w:spacing w:before="360" w:after="180"/>
-      </w:pPr>
-      <w:r>
-        <w:rPr>
+        <w:rPr>
+          <w:rFonts w:ascii="Abadi" w:hAnsi="Abadi"/>
           <w:b/>
           <w:bCs/>
           <w:color w:val="145A3A"/>
         </w:rPr>
-        <w:t>10. Approving a Checklist via Email</w:t>
-      </w:r>
-    </w:p>
-    <w:p>
-      <w:pPr>
-        <w:spacing w:after="160"/>
-      </w:pPr>
-      <w:r>
-        <w:t>You do not always need to log in to approve a checklist. When a checklist assigned to you is fully completed and ready, the email notification you receive includes a secure link. Opening that link shows a confirmation page where you can approve the checklist with a single click, without needing to sign in.</w:t>
-      </w:r>
+      </w:pPr>
+      <w:r>
+        <w:rPr>
+          <w:rFonts w:ascii="Abadi" w:hAnsi="Abadi"/>
+          <w:b/>
+          <w:bCs/>
+          <w:color w:val="145A3A"/>
+        </w:rPr>
+        <w:t>9. Notifications</w:t>
+      </w:r>
+    </w:p>
+    <w:p>
+      <w:pPr>
+        <w:rPr>
+          <w:rFonts w:ascii="Abadi" w:hAnsi="Abadi"/>
+        </w:rPr>
+      </w:pPr>
+    </w:p>
+    <w:p>
+      <w:pPr>
+        <w:spacing w:after="160"/>
+        <w:rPr>
+          <w:rFonts w:ascii="Abadi" w:hAnsi="Abadi"/>
+        </w:rPr>
+      </w:pPr>
+      <w:r>
+        <w:rPr>
+          <w:rFonts w:ascii="Abadi" w:hAnsi="Abadi"/>
+        </w:rPr>
+        <w:t xml:space="preserve">Upon successfully Saving Progress, Declining, </w:t>
+      </w:r>
+      <w:proofErr w:type="gramStart"/>
+      <w:r>
+        <w:rPr>
+          <w:rFonts w:ascii="Abadi" w:hAnsi="Abadi"/>
+        </w:rPr>
+        <w:t>Removing</w:t>
+      </w:r>
+      <w:proofErr w:type="gramEnd"/>
+      <w:r>
+        <w:rPr>
+          <w:rFonts w:ascii="Abadi" w:hAnsi="Abadi"/>
+        </w:rPr>
+        <w:t xml:space="preserve"> a Hold, or Approving a checklist, the system automatically generates a confirmation </w:t>
+      </w:r>
+      <w:proofErr w:type="gramStart"/>
+      <w:r>
+        <w:rPr>
+          <w:rFonts w:ascii="Abadi" w:hAnsi="Abadi"/>
+        </w:rPr>
+        <w:t>notification</w:t>
+      </w:r>
+      <w:proofErr w:type="gramEnd"/>
+      <w:r>
+        <w:rPr>
+          <w:rFonts w:ascii="Abadi" w:hAnsi="Abadi"/>
+        </w:rPr>
+        <w:t xml:space="preserve"> so you always know your action was recorded.</w:t>
+      </w:r>
+    </w:p>
+    <w:p>
+      <w:pPr>
+        <w:spacing w:after="160"/>
+        <w:rPr>
+          <w:rFonts w:ascii="Abadi" w:hAnsi="Abadi"/>
+        </w:rPr>
+      </w:pPr>
+      <w:r>
+        <w:rPr>
+          <w:rFonts w:ascii="Abadi" w:hAnsi="Abadi"/>
+        </w:rPr>
+        <w:t>In addition, once every task on a checklist assigned to you has been completed by the task assignee(s), the system automatically notifies you — both as an in-app notification (via the bell icon) and by email — that the checklist is now ready for your review and final approval.</w:t>
+      </w:r>
+    </w:p>
+    <w:p>
+      <w:pPr>
+        <w:spacing w:after="160"/>
+        <w:rPr>
+          <w:rFonts w:ascii="Abadi" w:hAnsi="Abadi"/>
+        </w:rPr>
+      </w:pPr>
+    </w:p>
+    <w:p>
+      <w:pPr>
+        <w:spacing w:after="160"/>
+        <w:rPr>
+          <w:rFonts w:ascii="Abadi" w:hAnsi="Abadi"/>
+        </w:rPr>
+      </w:pPr>
     </w:p>
     <w:p>
       <w:pPr>
         <w:spacing w:before="120" w:after="120"/>
         <w:jc w:val="center"/>
-      </w:pPr>
-      <w:r>
-        <w:rPr>
+        <w:rPr>
+          <w:rFonts w:ascii="Abadi" w:hAnsi="Abadi"/>
+        </w:rPr>
+      </w:pPr>
+      <w:r>
+        <w:rPr>
+          <w:rFonts w:ascii="Abadi" w:hAnsi="Abadi"/>
           <w:noProof/>
         </w:rPr>
-        <w:lastRenderedPageBreak/>
         <w:drawing>
-          <wp:inline distT="0" distB="0" distL="0" distR="0" wp14:anchorId="7A523CDB" wp14:editId="3FF590B9">
-            <wp:extent cx="4572000" cy="3200400"/>
+          <wp:inline distT="0" distB="0" distL="0" distR="0" wp14:anchorId="11D8FE56" wp14:editId="4CA1E81B">
+            <wp:extent cx="5524500" cy="3457575"/>
             <wp:effectExtent l="0" t="0" r="0" b="0"/>
-            <wp:docPr id="15" name="Picture 15"/>
+            <wp:docPr id="14" name="Picture 14"/>
             <wp:cNvGraphicFramePr>
               <a:graphicFrameLocks xmlns:a="http://schemas.openxmlformats.org/drawingml/2006/main" noChangeAspect="1"/>
             </wp:cNvGraphicFramePr>
@@ -1713,7 +2723,7 @@
                   <pic:spPr bwMode="auto">
                     <a:xfrm>
                       <a:off x="0" y="0"/>
-                      <a:ext cx="4572000" cy="3200400"/>
+                      <a:ext cx="5524500" cy="3457575"/>
                     </a:xfrm>
                     <a:prstGeom prst="rect">
                       <a:avLst/>
@@ -1730,59 +2740,95 @@
       <w:pPr>
         <w:spacing w:after="240"/>
         <w:jc w:val="center"/>
-      </w:pPr>
-      <w:r>
-        <w:rPr>
-          <w:i/>
-          <w:iCs/>
-          <w:color w:val="6B7280"/>
-          <w:sz w:val="20"/>
-          <w:szCs w:val="20"/>
-        </w:rPr>
-        <w:t>Figure 10.1 — The email approval confirmation page, reached directly from the notification email.</w:t>
-      </w:r>
+        <w:rPr>
+          <w:rFonts w:ascii="Abadi" w:hAnsi="Abadi"/>
+          <w:i/>
+          <w:iCs/>
+          <w:color w:val="6B7280"/>
+          <w:sz w:val="20"/>
+          <w:szCs w:val="20"/>
+        </w:rPr>
+      </w:pPr>
+      <w:r>
+        <w:rPr>
+          <w:rFonts w:ascii="Abadi" w:hAnsi="Abadi"/>
+          <w:i/>
+          <w:iCs/>
+          <w:color w:val="6B7280"/>
+          <w:sz w:val="20"/>
+          <w:szCs w:val="20"/>
+        </w:rPr>
+        <w:t>Figure 9.1 — An in-app “Ready for Your Approval” notification in the bell dropdown.</w:t>
+      </w:r>
+    </w:p>
+    <w:p>
+      <w:pPr>
+        <w:spacing w:after="240"/>
+        <w:jc w:val="center"/>
+        <w:rPr>
+          <w:rFonts w:ascii="Abadi" w:hAnsi="Abadi"/>
+        </w:rPr>
+      </w:pPr>
     </w:p>
     <w:p>
       <w:pPr>
         <w:pStyle w:val="Heading1"/>
         <w:spacing w:before="360" w:after="180"/>
-      </w:pPr>
-      <w:r>
-        <w:rPr>
+        <w:rPr>
+          <w:rFonts w:ascii="Abadi" w:hAnsi="Abadi"/>
+        </w:rPr>
+      </w:pPr>
+      <w:r>
+        <w:rPr>
+          <w:rFonts w:ascii="Abadi" w:hAnsi="Abadi"/>
           <w:b/>
           <w:bCs/>
           <w:color w:val="145A3A"/>
         </w:rPr>
-        <w:t>11. Checklist Status — Viewing Offboarding Progress</w:t>
-      </w:r>
-    </w:p>
-    <w:p>
-      <w:pPr>
-        <w:spacing w:after="160"/>
-      </w:pPr>
-      <w:r>
-        <w:t>To see the complete history and current progress of an employee’s offboarding — not just this one checklist, but every milestone reached so far — click Checklist Status on the card. This opens a read-only timeline.</w:t>
-      </w:r>
-    </w:p>
-    <w:p>
-      <w:pPr>
-        <w:spacing w:after="160"/>
-      </w:pPr>
-    </w:p>
-    <w:p>
-      <w:pPr>
-        <w:spacing w:before="120" w:after="120"/>
-        <w:jc w:val="center"/>
-      </w:pPr>
-      <w:r>
-        <w:rPr>
+        <w:t>10. Approving a Checklist via Email</w:t>
+      </w:r>
+    </w:p>
+    <w:p>
+      <w:pPr>
+        <w:spacing w:after="160"/>
+        <w:rPr>
+          <w:rFonts w:ascii="Abadi" w:hAnsi="Abadi"/>
+        </w:rPr>
+      </w:pPr>
+      <w:r>
+        <w:rPr>
+          <w:rFonts w:ascii="Abadi" w:hAnsi="Abadi"/>
+        </w:rPr>
+        <w:t>You do not always need to log in to approve a checklist. When a checklist assigned to you is fully completed and ready, the email notification you receive includes a secure link. Opening that link shows a confirmation page where you can approve the checklist with a single click, without needing to sign in.</w:t>
+      </w:r>
+    </w:p>
+    <w:p>
+      <w:pPr>
+        <w:spacing w:after="160"/>
+        <w:rPr>
+          <w:rFonts w:ascii="Abadi" w:hAnsi="Abadi"/>
+        </w:rPr>
+      </w:pPr>
+    </w:p>
+    <w:p>
+      <w:pPr>
+        <w:spacing w:after="160"/>
+        <w:jc w:val="center"/>
+        <w:rPr>
+          <w:rFonts w:ascii="Abadi" w:hAnsi="Abadi"/>
+        </w:rPr>
+      </w:pPr>
+      <w:r>
+        <w:rPr>
+          <w:rFonts w:ascii="Abadi" w:hAnsi="Abadi"/>
           <w:noProof/>
         </w:rPr>
+        <w:lastRenderedPageBreak/>
         <w:drawing>
-          <wp:inline distT="0" distB="0" distL="0" distR="0" wp14:anchorId="4ABDEA17" wp14:editId="72CA48DF">
-            <wp:extent cx="5334000" cy="3333750"/>
-            <wp:effectExtent l="0" t="0" r="0" b="0"/>
-            <wp:docPr id="16" name="Picture 16"/>
+          <wp:inline distT="0" distB="0" distL="0" distR="0" wp14:anchorId="0B8C1649" wp14:editId="183F9DCD">
+            <wp:extent cx="4549534" cy="4359018"/>
+            <wp:effectExtent l="0" t="0" r="3810" b="3810"/>
+            <wp:docPr id="938606117" name="Picture 1"/>
             <wp:cNvGraphicFramePr>
               <a:graphicFrameLocks xmlns:a="http://schemas.openxmlformats.org/drawingml/2006/main" noChangeAspect="1"/>
             </wp:cNvGraphicFramePr>
@@ -1790,22 +2836,19 @@
               <a:graphicData uri="http://schemas.openxmlformats.org/drawingml/2006/picture">
                 <pic:pic xmlns:pic="http://schemas.openxmlformats.org/drawingml/2006/picture">
                   <pic:nvPicPr>
-                    <pic:cNvPr id="0" name=""/>
-                    <pic:cNvPicPr>
-                      <a:picLocks noChangeAspect="1" noChangeArrowheads="1"/>
-                    </pic:cNvPicPr>
+                    <pic:cNvPr id="938606117" name=""/>
+                    <pic:cNvPicPr/>
                   </pic:nvPicPr>
                   <pic:blipFill>
                     <a:blip r:embed="rId21"/>
-                    <a:srcRect/>
                     <a:stretch>
                       <a:fillRect/>
                     </a:stretch>
                   </pic:blipFill>
-                  <pic:spPr bwMode="auto">
+                  <pic:spPr>
                     <a:xfrm>
                       <a:off x="0" y="0"/>
-                      <a:ext cx="5334000" cy="3333750"/>
+                      <a:ext cx="4549534" cy="4359018"/>
                     </a:xfrm>
                     <a:prstGeom prst="rect">
                       <a:avLst/>
@@ -1822,60 +2865,76 @@
       <w:pPr>
         <w:spacing w:after="240"/>
         <w:jc w:val="center"/>
-      </w:pPr>
-      <w:r>
-        <w:rPr>
-          <w:i/>
-          <w:iCs/>
-          <w:color w:val="6B7280"/>
-          <w:sz w:val="20"/>
-          <w:szCs w:val="20"/>
-        </w:rPr>
-        <w:t>Figure 11.1 — The Checklist Status timeline, showing every action taken on this offboarding case so far.</w:t>
-      </w:r>
-    </w:p>
-    <w:p>
-      <w:pPr>
-        <w:pStyle w:val="Heading1"/>
-        <w:spacing w:before="360" w:after="180"/>
-      </w:pPr>
-      <w:r>
-        <w:rPr>
-          <w:b/>
-          <w:bCs/>
-          <w:color w:val="145A3A"/>
-        </w:rPr>
-        <w:lastRenderedPageBreak/>
-        <w:t>12. Assign Checklist — Assigning/Reassigning Tasks</w:t>
-      </w:r>
-    </w:p>
-    <w:p>
-      <w:pPr>
-        <w:spacing w:after="160"/>
-      </w:pPr>
-      <w:r>
-        <w:t>If a checklist (or part of it) needs to be handled by someone else, click the Assign Checklist button on the card. This lets you reassign every not-yet-completed task on the checklist to another employee. The original assignee, if any, keeps access to their own previously assigned tasks.</w:t>
-      </w:r>
-    </w:p>
-    <w:p>
-      <w:pPr>
-        <w:spacing w:after="160"/>
+        <w:rPr>
+          <w:rFonts w:ascii="Abadi" w:hAnsi="Abadi"/>
+          <w:i/>
+          <w:iCs/>
+          <w:color w:val="6B7280"/>
+          <w:sz w:val="20"/>
+          <w:szCs w:val="20"/>
+        </w:rPr>
+      </w:pPr>
+      <w:r>
+        <w:rPr>
+          <w:rFonts w:ascii="Abadi" w:hAnsi="Abadi"/>
+          <w:i/>
+          <w:iCs/>
+          <w:color w:val="6B7280"/>
+          <w:sz w:val="20"/>
+          <w:szCs w:val="20"/>
+        </w:rPr>
+        <w:t xml:space="preserve">Figure 10 — The </w:t>
+      </w:r>
+      <w:r>
+        <w:rPr>
+          <w:rFonts w:ascii="Abadi" w:hAnsi="Abadi"/>
+          <w:i/>
+          <w:iCs/>
+          <w:color w:val="6B7280"/>
+          <w:sz w:val="20"/>
+          <w:szCs w:val="20"/>
+        </w:rPr>
+        <w:t>email notification format received by assigned Approver</w:t>
+      </w:r>
+      <w:r>
+        <w:rPr>
+          <w:rFonts w:ascii="Abadi" w:hAnsi="Abadi"/>
+          <w:i/>
+          <w:iCs/>
+          <w:color w:val="6B7280"/>
+          <w:sz w:val="20"/>
+          <w:szCs w:val="20"/>
+        </w:rPr>
+        <w:t>.</w:t>
+      </w:r>
+    </w:p>
+    <w:p>
+      <w:pPr>
+        <w:spacing w:after="160"/>
+        <w:jc w:val="center"/>
+        <w:rPr>
+          <w:rFonts w:ascii="Abadi" w:hAnsi="Abadi"/>
+        </w:rPr>
       </w:pPr>
     </w:p>
     <w:p>
       <w:pPr>
         <w:spacing w:before="120" w:after="120"/>
         <w:jc w:val="center"/>
-      </w:pPr>
-      <w:r>
-        <w:rPr>
+        <w:rPr>
+          <w:rFonts w:ascii="Abadi" w:hAnsi="Abadi"/>
+        </w:rPr>
+      </w:pPr>
+      <w:r>
+        <w:rPr>
+          <w:rFonts w:ascii="Abadi" w:hAnsi="Abadi"/>
           <w:noProof/>
         </w:rPr>
         <w:drawing>
-          <wp:inline distT="0" distB="0" distL="0" distR="0" wp14:anchorId="555A8F04" wp14:editId="0E2D7DF9">
-            <wp:extent cx="5334000" cy="3333750"/>
+          <wp:inline distT="0" distB="0" distL="0" distR="0" wp14:anchorId="7A523CDB" wp14:editId="3FF590B9">
+            <wp:extent cx="4572000" cy="3200400"/>
             <wp:effectExtent l="0" t="0" r="0" b="0"/>
-            <wp:docPr id="17" name="Picture 17"/>
+            <wp:docPr id="15" name="Picture 15"/>
             <wp:cNvGraphicFramePr>
               <a:graphicFrameLocks xmlns:a="http://schemas.openxmlformats.org/drawingml/2006/main" noChangeAspect="1"/>
             </wp:cNvGraphicFramePr>
@@ -1898,6 +2957,454 @@
                   <pic:spPr bwMode="auto">
                     <a:xfrm>
                       <a:off x="0" y="0"/>
+                      <a:ext cx="4572000" cy="3200400"/>
+                    </a:xfrm>
+                    <a:prstGeom prst="rect">
+                      <a:avLst/>
+                    </a:prstGeom>
+                  </pic:spPr>
+                </pic:pic>
+              </a:graphicData>
+            </a:graphic>
+          </wp:inline>
+        </w:drawing>
+      </w:r>
+    </w:p>
+    <w:p>
+      <w:pPr>
+        <w:spacing w:after="240"/>
+        <w:jc w:val="center"/>
+        <w:rPr>
+          <w:rFonts w:ascii="Abadi" w:hAnsi="Abadi"/>
+          <w:i/>
+          <w:iCs/>
+          <w:color w:val="6B7280"/>
+          <w:sz w:val="20"/>
+          <w:szCs w:val="20"/>
+        </w:rPr>
+      </w:pPr>
+      <w:r>
+        <w:rPr>
+          <w:rFonts w:ascii="Abadi" w:hAnsi="Abadi"/>
+          <w:i/>
+          <w:iCs/>
+          <w:color w:val="6B7280"/>
+          <w:sz w:val="20"/>
+          <w:szCs w:val="20"/>
+        </w:rPr>
+        <w:t>Figure 10.1 — The email approval confirmation page, reached directly from the notification email.</w:t>
+      </w:r>
+    </w:p>
+    <w:p>
+      <w:pPr>
+        <w:spacing w:after="240"/>
+        <w:jc w:val="center"/>
+        <w:rPr>
+          <w:rFonts w:ascii="Abadi" w:hAnsi="Abadi"/>
+          <w:i/>
+          <w:iCs/>
+          <w:color w:val="6B7280"/>
+          <w:sz w:val="20"/>
+          <w:szCs w:val="20"/>
+        </w:rPr>
+      </w:pPr>
+    </w:p>
+    <w:p>
+      <w:pPr>
+        <w:spacing w:after="240"/>
+        <w:jc w:val="center"/>
+        <w:rPr>
+          <w:rFonts w:ascii="Abadi" w:hAnsi="Abadi"/>
+        </w:rPr>
+      </w:pPr>
+    </w:p>
+    <w:p>
+      <w:pPr>
+        <w:pStyle w:val="Heading1"/>
+        <w:spacing w:before="360" w:after="180"/>
+        <w:rPr>
+          <w:rFonts w:ascii="Abadi" w:hAnsi="Abadi"/>
+          <w:b/>
+          <w:bCs/>
+          <w:color w:val="145A3A"/>
+        </w:rPr>
+      </w:pPr>
+      <w:r>
+        <w:rPr>
+          <w:rFonts w:ascii="Abadi" w:hAnsi="Abadi"/>
+          <w:b/>
+          <w:bCs/>
+          <w:color w:val="145A3A"/>
+        </w:rPr>
+        <w:t>11. Checklist Status — Viewing Offboarding Progress</w:t>
+      </w:r>
+    </w:p>
+    <w:p/>
+    <w:p>
+      <w:pPr>
+        <w:spacing w:after="160"/>
+        <w:rPr>
+          <w:rFonts w:ascii="Abadi" w:hAnsi="Abadi"/>
+        </w:rPr>
+      </w:pPr>
+      <w:r>
+        <w:rPr>
+          <w:rFonts w:ascii="Abadi" w:hAnsi="Abadi"/>
+        </w:rPr>
+        <w:t>To see the complete history and current progress of an employee’s offboarding — not just this one checklist, but every milestone reached so far — click Checklist Status on the card. This opens a read-only timeline.</w:t>
+      </w:r>
+    </w:p>
+    <w:p>
+      <w:pPr>
+        <w:spacing w:after="160"/>
+        <w:rPr>
+          <w:rFonts w:ascii="Abadi" w:hAnsi="Abadi"/>
+        </w:rPr>
+      </w:pPr>
+    </w:p>
+    <w:p>
+      <w:pPr>
+        <w:spacing w:before="120" w:after="120"/>
+        <w:jc w:val="center"/>
+        <w:rPr>
+          <w:rFonts w:ascii="Abadi" w:hAnsi="Abadi"/>
+        </w:rPr>
+      </w:pPr>
+      <w:r>
+        <w:rPr>
+          <w:rFonts w:ascii="Abadi" w:hAnsi="Abadi"/>
+        </w:rPr>
+        <w:drawing>
+          <wp:inline distT="0" distB="0" distL="0" distR="0" wp14:anchorId="126CC63D" wp14:editId="599FDC02">
+            <wp:extent cx="5155106" cy="3924300"/>
+            <wp:effectExtent l="0" t="0" r="7620" b="0"/>
+            <wp:docPr id="883674913" name="Picture 1"/>
+            <wp:cNvGraphicFramePr>
+              <a:graphicFrameLocks xmlns:a="http://schemas.openxmlformats.org/drawingml/2006/main" noChangeAspect="1"/>
+            </wp:cNvGraphicFramePr>
+            <a:graphic xmlns:a="http://schemas.openxmlformats.org/drawingml/2006/main">
+              <a:graphicData uri="http://schemas.openxmlformats.org/drawingml/2006/picture">
+                <pic:pic xmlns:pic="http://schemas.openxmlformats.org/drawingml/2006/picture">
+                  <pic:nvPicPr>
+                    <pic:cNvPr id="883674913" name=""/>
+                    <pic:cNvPicPr/>
+                  </pic:nvPicPr>
+                  <pic:blipFill>
+                    <a:blip r:embed="rId23"/>
+                    <a:stretch>
+                      <a:fillRect/>
+                    </a:stretch>
+                  </pic:blipFill>
+                  <pic:spPr>
+                    <a:xfrm>
+                      <a:off x="0" y="0"/>
+                      <a:ext cx="5162831" cy="3930181"/>
+                    </a:xfrm>
+                    <a:prstGeom prst="rect">
+                      <a:avLst/>
+                    </a:prstGeom>
+                  </pic:spPr>
+                </pic:pic>
+              </a:graphicData>
+            </a:graphic>
+          </wp:inline>
+        </w:drawing>
+      </w:r>
+    </w:p>
+    <w:p>
+      <w:pPr>
+        <w:spacing w:after="240"/>
+        <w:jc w:val="center"/>
+        <w:rPr>
+          <w:rFonts w:ascii="Abadi" w:hAnsi="Abadi"/>
+          <w:i/>
+          <w:iCs/>
+          <w:color w:val="6B7280"/>
+          <w:sz w:val="20"/>
+          <w:szCs w:val="20"/>
+        </w:rPr>
+      </w:pPr>
+      <w:r>
+        <w:rPr>
+          <w:rFonts w:ascii="Abadi" w:hAnsi="Abadi"/>
+          <w:i/>
+          <w:iCs/>
+          <w:color w:val="6B7280"/>
+          <w:sz w:val="20"/>
+          <w:szCs w:val="20"/>
+        </w:rPr>
+        <w:t>Figure 11.1 — The Checklist Status timeline, showing every action taken on this offboarding case so far.</w:t>
+      </w:r>
+    </w:p>
+    <w:p>
+      <w:pPr>
+        <w:spacing w:after="240"/>
+        <w:jc w:val="center"/>
+        <w:rPr>
+          <w:rFonts w:ascii="Abadi" w:hAnsi="Abadi"/>
+          <w:i/>
+          <w:iCs/>
+          <w:color w:val="6B7280"/>
+          <w:sz w:val="20"/>
+          <w:szCs w:val="20"/>
+        </w:rPr>
+      </w:pPr>
+    </w:p>
+    <w:p>
+      <w:pPr>
+        <w:spacing w:after="240"/>
+        <w:jc w:val="center"/>
+        <w:rPr>
+          <w:rFonts w:ascii="Abadi" w:hAnsi="Abadi"/>
+          <w:i/>
+          <w:iCs/>
+          <w:color w:val="6B7280"/>
+          <w:sz w:val="20"/>
+          <w:szCs w:val="20"/>
+        </w:rPr>
+      </w:pPr>
+    </w:p>
+    <w:p>
+      <w:pPr>
+        <w:spacing w:after="240"/>
+        <w:jc w:val="center"/>
+        <w:rPr>
+          <w:rFonts w:ascii="Abadi" w:hAnsi="Abadi"/>
+          <w:i/>
+          <w:iCs/>
+          <w:color w:val="6B7280"/>
+          <w:sz w:val="20"/>
+          <w:szCs w:val="20"/>
+        </w:rPr>
+      </w:pPr>
+    </w:p>
+    <w:p>
+      <w:pPr>
+        <w:spacing w:after="240"/>
+        <w:jc w:val="center"/>
+        <w:rPr>
+          <w:rFonts w:ascii="Abadi" w:hAnsi="Abadi"/>
+          <w:i/>
+          <w:iCs/>
+          <w:color w:val="6B7280"/>
+          <w:sz w:val="20"/>
+          <w:szCs w:val="20"/>
+        </w:rPr>
+      </w:pPr>
+    </w:p>
+    <w:p>
+      <w:pPr>
+        <w:spacing w:after="240"/>
+        <w:jc w:val="center"/>
+        <w:rPr>
+          <w:rFonts w:ascii="Abadi" w:hAnsi="Abadi"/>
+          <w:i/>
+          <w:iCs/>
+          <w:color w:val="6B7280"/>
+          <w:sz w:val="20"/>
+          <w:szCs w:val="20"/>
+        </w:rPr>
+      </w:pPr>
+    </w:p>
+    <w:p>
+      <w:pPr>
+        <w:spacing w:after="240"/>
+        <w:jc w:val="center"/>
+        <w:rPr>
+          <w:rFonts w:ascii="Abadi" w:hAnsi="Abadi"/>
+          <w:i/>
+          <w:iCs/>
+          <w:color w:val="6B7280"/>
+          <w:sz w:val="20"/>
+          <w:szCs w:val="20"/>
+        </w:rPr>
+      </w:pPr>
+    </w:p>
+    <w:p>
+      <w:pPr>
+        <w:spacing w:after="240"/>
+        <w:jc w:val="center"/>
+        <w:rPr>
+          <w:rFonts w:ascii="Abadi" w:hAnsi="Abadi"/>
+          <w:i/>
+          <w:iCs/>
+          <w:color w:val="6B7280"/>
+          <w:sz w:val="20"/>
+          <w:szCs w:val="20"/>
+        </w:rPr>
+      </w:pPr>
+    </w:p>
+    <w:p>
+      <w:pPr>
+        <w:spacing w:after="240"/>
+        <w:jc w:val="center"/>
+        <w:rPr>
+          <w:rFonts w:ascii="Abadi" w:hAnsi="Abadi"/>
+          <w:i/>
+          <w:iCs/>
+          <w:color w:val="6B7280"/>
+          <w:sz w:val="20"/>
+          <w:szCs w:val="20"/>
+        </w:rPr>
+      </w:pPr>
+    </w:p>
+    <w:p>
+      <w:pPr>
+        <w:spacing w:after="240"/>
+        <w:jc w:val="center"/>
+        <w:rPr>
+          <w:rFonts w:ascii="Abadi" w:hAnsi="Abadi"/>
+          <w:i/>
+          <w:iCs/>
+          <w:color w:val="6B7280"/>
+          <w:sz w:val="20"/>
+          <w:szCs w:val="20"/>
+        </w:rPr>
+      </w:pPr>
+    </w:p>
+    <w:p>
+      <w:pPr>
+        <w:spacing w:after="240"/>
+        <w:jc w:val="center"/>
+        <w:rPr>
+          <w:rFonts w:ascii="Abadi" w:hAnsi="Abadi"/>
+          <w:i/>
+          <w:iCs/>
+          <w:color w:val="6B7280"/>
+          <w:sz w:val="20"/>
+          <w:szCs w:val="20"/>
+        </w:rPr>
+      </w:pPr>
+    </w:p>
+    <w:p>
+      <w:pPr>
+        <w:spacing w:after="240"/>
+        <w:jc w:val="center"/>
+        <w:rPr>
+          <w:rFonts w:ascii="Abadi" w:hAnsi="Abadi"/>
+          <w:i/>
+          <w:iCs/>
+          <w:color w:val="6B7280"/>
+          <w:sz w:val="20"/>
+          <w:szCs w:val="20"/>
+        </w:rPr>
+      </w:pPr>
+    </w:p>
+    <w:p>
+      <w:pPr>
+        <w:spacing w:after="240"/>
+        <w:jc w:val="center"/>
+        <w:rPr>
+          <w:rFonts w:ascii="Abadi" w:hAnsi="Abadi"/>
+          <w:i/>
+          <w:iCs/>
+          <w:color w:val="6B7280"/>
+          <w:sz w:val="20"/>
+          <w:szCs w:val="20"/>
+        </w:rPr>
+      </w:pPr>
+    </w:p>
+    <w:p>
+      <w:pPr>
+        <w:spacing w:after="240"/>
+        <w:jc w:val="center"/>
+        <w:rPr>
+          <w:rFonts w:ascii="Abadi" w:hAnsi="Abadi"/>
+        </w:rPr>
+      </w:pPr>
+    </w:p>
+    <w:p>
+      <w:pPr>
+        <w:pStyle w:val="Heading1"/>
+        <w:spacing w:before="360" w:after="180"/>
+        <w:rPr>
+          <w:rFonts w:ascii="Abadi" w:hAnsi="Abadi"/>
+          <w:b/>
+          <w:bCs/>
+          <w:color w:val="145A3A"/>
+        </w:rPr>
+      </w:pPr>
+      <w:r>
+        <w:rPr>
+          <w:rFonts w:ascii="Abadi" w:hAnsi="Abadi"/>
+          <w:b/>
+          <w:bCs/>
+          <w:color w:val="145A3A"/>
+        </w:rPr>
+        <w:t>12. Assign Checklist — Assigning/Reassigning Tasks</w:t>
+      </w:r>
+    </w:p>
+    <w:p/>
+    <w:p>
+      <w:pPr>
+        <w:spacing w:after="160"/>
+        <w:rPr>
+          <w:rFonts w:ascii="Abadi" w:hAnsi="Abadi"/>
+        </w:rPr>
+      </w:pPr>
+      <w:r>
+        <w:rPr>
+          <w:rFonts w:ascii="Abadi" w:hAnsi="Abadi"/>
+        </w:rPr>
+        <w:t>If a checklist (or part of it) needs to be handled by someone else, click the Assign Checklist button on the card. This lets you reassign every not-yet-completed task on the checklist to another employee. The original assignee, if any, keeps access to their own previously assigned tasks.</w:t>
+      </w:r>
+    </w:p>
+    <w:p>
+      <w:pPr>
+        <w:spacing w:after="160"/>
+        <w:rPr>
+          <w:rFonts w:ascii="Abadi" w:hAnsi="Abadi"/>
+        </w:rPr>
+      </w:pPr>
+    </w:p>
+    <w:p>
+      <w:pPr>
+        <w:spacing w:after="160"/>
+        <w:rPr>
+          <w:rFonts w:ascii="Abadi" w:hAnsi="Abadi"/>
+        </w:rPr>
+      </w:pPr>
+    </w:p>
+    <w:p>
+      <w:pPr>
+        <w:spacing w:before="120" w:after="120"/>
+        <w:jc w:val="center"/>
+        <w:rPr>
+          <w:rFonts w:ascii="Abadi" w:hAnsi="Abadi"/>
+        </w:rPr>
+      </w:pPr>
+      <w:r>
+        <w:rPr>
+          <w:rFonts w:ascii="Abadi" w:hAnsi="Abadi"/>
+          <w:noProof/>
+        </w:rPr>
+        <w:drawing>
+          <wp:inline distT="0" distB="0" distL="0" distR="0" wp14:anchorId="555A8F04" wp14:editId="0E2D7DF9">
+            <wp:extent cx="5334000" cy="3333750"/>
+            <wp:effectExtent l="0" t="0" r="0" b="0"/>
+            <wp:docPr id="17" name="Picture 17"/>
+            <wp:cNvGraphicFramePr>
+              <a:graphicFrameLocks xmlns:a="http://schemas.openxmlformats.org/drawingml/2006/main" noChangeAspect="1"/>
+            </wp:cNvGraphicFramePr>
+            <a:graphic xmlns:a="http://schemas.openxmlformats.org/drawingml/2006/main">
+              <a:graphicData uri="http://schemas.openxmlformats.org/drawingml/2006/picture">
+                <pic:pic xmlns:pic="http://schemas.openxmlformats.org/drawingml/2006/picture">
+                  <pic:nvPicPr>
+                    <pic:cNvPr id="0" name=""/>
+                    <pic:cNvPicPr>
+                      <a:picLocks noChangeAspect="1" noChangeArrowheads="1"/>
+                    </pic:cNvPicPr>
+                  </pic:nvPicPr>
+                  <pic:blipFill>
+                    <a:blip r:embed="rId24"/>
+                    <a:srcRect/>
+                    <a:stretch>
+                      <a:fillRect/>
+                    </a:stretch>
+                  </pic:blipFill>
+                  <pic:spPr bwMode="auto">
+                    <a:xfrm>
+                      <a:off x="0" y="0"/>
                       <a:ext cx="5334000" cy="3333750"/>
                     </a:xfrm>
                     <a:prstGeom prst="rect">
@@ -1915,9 +3422,18 @@
       <w:pPr>
         <w:spacing w:after="240"/>
         <w:jc w:val="center"/>
-      </w:pPr>
-      <w:r>
-        <w:rPr>
+        <w:rPr>
+          <w:rFonts w:ascii="Abadi" w:hAnsi="Abadi"/>
+          <w:i/>
+          <w:iCs/>
+          <w:color w:val="6B7280"/>
+          <w:sz w:val="20"/>
+          <w:szCs w:val="20"/>
+        </w:rPr>
+      </w:pPr>
+      <w:r>
+        <w:rPr>
+          <w:rFonts w:ascii="Abadi" w:hAnsi="Abadi"/>
           <w:i/>
           <w:iCs/>
           <w:color w:val="6B7280"/>
@@ -1926,14 +3442,181 @@
         </w:rPr>
         <w:t>Figure 12.1 — Reassigning an entire checklist to another employee.</w:t>
       </w:r>
+    </w:p>
+    <w:p>
+      <w:pPr>
+        <w:spacing w:after="240"/>
+        <w:jc w:val="center"/>
+        <w:rPr>
+          <w:rFonts w:ascii="Abadi" w:hAnsi="Abadi"/>
+          <w:i/>
+          <w:iCs/>
+          <w:color w:val="6B7280"/>
+          <w:sz w:val="20"/>
+          <w:szCs w:val="20"/>
+        </w:rPr>
+      </w:pPr>
+    </w:p>
+    <w:p>
+      <w:pPr>
+        <w:spacing w:after="240"/>
+        <w:jc w:val="center"/>
+        <w:rPr>
+          <w:rFonts w:ascii="Abadi" w:hAnsi="Abadi"/>
+          <w:i/>
+          <w:iCs/>
+          <w:color w:val="6B7280"/>
+          <w:sz w:val="20"/>
+          <w:szCs w:val="20"/>
+        </w:rPr>
+      </w:pPr>
+    </w:p>
+    <w:p>
+      <w:pPr>
+        <w:spacing w:after="240"/>
+        <w:jc w:val="center"/>
+        <w:rPr>
+          <w:rFonts w:ascii="Abadi" w:hAnsi="Abadi"/>
+          <w:i/>
+          <w:iCs/>
+          <w:color w:val="6B7280"/>
+          <w:sz w:val="20"/>
+          <w:szCs w:val="20"/>
+        </w:rPr>
+      </w:pPr>
+    </w:p>
+    <w:p>
+      <w:pPr>
+        <w:spacing w:after="240"/>
+        <w:jc w:val="center"/>
+        <w:rPr>
+          <w:rFonts w:ascii="Abadi" w:hAnsi="Abadi"/>
+          <w:i/>
+          <w:iCs/>
+          <w:color w:val="6B7280"/>
+          <w:sz w:val="20"/>
+          <w:szCs w:val="20"/>
+        </w:rPr>
+      </w:pPr>
+    </w:p>
+    <w:p>
+      <w:pPr>
+        <w:spacing w:after="240"/>
+        <w:jc w:val="center"/>
+        <w:rPr>
+          <w:rFonts w:ascii="Abadi" w:hAnsi="Abadi"/>
+          <w:i/>
+          <w:iCs/>
+          <w:color w:val="6B7280"/>
+          <w:sz w:val="20"/>
+          <w:szCs w:val="20"/>
+        </w:rPr>
+      </w:pPr>
+    </w:p>
+    <w:p>
+      <w:pPr>
+        <w:spacing w:after="240"/>
+        <w:jc w:val="center"/>
+        <w:rPr>
+          <w:rFonts w:ascii="Abadi" w:hAnsi="Abadi"/>
+          <w:i/>
+          <w:iCs/>
+          <w:color w:val="6B7280"/>
+          <w:sz w:val="20"/>
+          <w:szCs w:val="20"/>
+        </w:rPr>
+      </w:pPr>
+    </w:p>
+    <w:p>
+      <w:pPr>
+        <w:spacing w:after="240"/>
+        <w:jc w:val="center"/>
+        <w:rPr>
+          <w:rFonts w:ascii="Abadi" w:hAnsi="Abadi"/>
+          <w:i/>
+          <w:iCs/>
+          <w:color w:val="6B7280"/>
+          <w:sz w:val="20"/>
+          <w:szCs w:val="20"/>
+        </w:rPr>
+      </w:pPr>
+    </w:p>
+    <w:p>
+      <w:pPr>
+        <w:spacing w:after="240"/>
+        <w:jc w:val="center"/>
+        <w:rPr>
+          <w:rFonts w:ascii="Abadi" w:hAnsi="Abadi"/>
+          <w:i/>
+          <w:iCs/>
+          <w:color w:val="6B7280"/>
+          <w:sz w:val="20"/>
+          <w:szCs w:val="20"/>
+        </w:rPr>
+      </w:pPr>
+    </w:p>
+    <w:p>
+      <w:pPr>
+        <w:spacing w:after="240"/>
+        <w:jc w:val="center"/>
+        <w:rPr>
+          <w:rFonts w:ascii="Abadi" w:hAnsi="Abadi"/>
+          <w:i/>
+          <w:iCs/>
+          <w:color w:val="6B7280"/>
+          <w:sz w:val="20"/>
+          <w:szCs w:val="20"/>
+        </w:rPr>
+      </w:pPr>
+    </w:p>
+    <w:p>
+      <w:pPr>
+        <w:spacing w:after="240"/>
+        <w:jc w:val="center"/>
+        <w:rPr>
+          <w:rFonts w:ascii="Abadi" w:hAnsi="Abadi"/>
+          <w:i/>
+          <w:iCs/>
+          <w:color w:val="6B7280"/>
+          <w:sz w:val="20"/>
+          <w:szCs w:val="20"/>
+        </w:rPr>
+      </w:pPr>
+    </w:p>
+    <w:p>
+      <w:pPr>
+        <w:spacing w:after="240"/>
+        <w:jc w:val="center"/>
+        <w:rPr>
+          <w:rFonts w:ascii="Abadi" w:hAnsi="Abadi"/>
+          <w:i/>
+          <w:iCs/>
+          <w:color w:val="6B7280"/>
+          <w:sz w:val="20"/>
+          <w:szCs w:val="20"/>
+        </w:rPr>
+      </w:pPr>
+    </w:p>
+    <w:p>
+      <w:pPr>
+        <w:spacing w:after="240"/>
+        <w:jc w:val="center"/>
+        <w:rPr>
+          <w:rFonts w:ascii="Abadi" w:hAnsi="Abadi"/>
+        </w:rPr>
+      </w:pPr>
     </w:p>
     <w:p>
       <w:pPr>
         <w:pStyle w:val="Heading1"/>
         <w:spacing w:before="360" w:after="180"/>
-      </w:pPr>
-      <w:r>
-        <w:rPr>
+        <w:rPr>
+          <w:rFonts w:ascii="Abadi" w:hAnsi="Abadi"/>
+        </w:rPr>
+      </w:pPr>
+      <w:r>
+        <w:rPr>
+          <w:rFonts w:ascii="Abadi" w:hAnsi="Abadi"/>
           <w:b/>
           <w:bCs/>
           <w:color w:val="145A3A"/>
@@ -1944,21 +3627,38 @@
     <w:p>
       <w:pPr>
         <w:spacing w:after="160"/>
-      </w:pPr>
-      <w:r>
+        <w:rPr>
+          <w:rFonts w:ascii="Abadi" w:hAnsi="Abadi"/>
+        </w:rPr>
+      </w:pPr>
+      <w:r>
+        <w:rPr>
+          <w:rFonts w:ascii="Abadi" w:hAnsi="Abadi"/>
+        </w:rPr>
         <w:t>Once you approve a checklist, it is considered fully resolved on your end. The checklist automatically disappears from your Approval page — it no longer requires any action from you. (If every regular checklist for that employee has also been completed, the system may automatically move the case forward to its next stage, such as a Final Pay Checklist, which will then appear on your Approval page if you are responsible for it.)</w:t>
       </w:r>
     </w:p>
     <w:p>
       <w:pPr>
+        <w:spacing w:after="160"/>
+        <w:rPr>
+          <w:rFonts w:ascii="Abadi" w:hAnsi="Abadi"/>
+        </w:rPr>
+      </w:pPr>
+    </w:p>
+    <w:p>
+      <w:pPr>
         <w:spacing w:before="120" w:after="120"/>
         <w:jc w:val="center"/>
-      </w:pPr>
-      <w:r>
-        <w:rPr>
+        <w:rPr>
+          <w:rFonts w:ascii="Abadi" w:hAnsi="Abadi"/>
+        </w:rPr>
+      </w:pPr>
+      <w:r>
+        <w:rPr>
+          <w:rFonts w:ascii="Abadi" w:hAnsi="Abadi"/>
           <w:noProof/>
         </w:rPr>
-        <w:lastRenderedPageBreak/>
         <w:drawing>
           <wp:inline distT="0" distB="0" distL="0" distR="0" wp14:anchorId="0246740E" wp14:editId="63DEF235">
             <wp:extent cx="5524500" cy="3457575"/>
@@ -1977,7 +3677,7 @@
                     </pic:cNvPicPr>
                   </pic:nvPicPr>
                   <pic:blipFill>
-                    <a:blip r:embed="rId23"/>
+                    <a:blip r:embed="rId25"/>
                     <a:srcRect/>
                     <a:stretch>
                       <a:fillRect/>
@@ -2004,15 +3704,17 @@
         <w:spacing w:after="240"/>
         <w:jc w:val="center"/>
         <w:rPr>
-          <w:i/>
-          <w:iCs/>
-          <w:color w:val="6B7280"/>
-          <w:sz w:val="20"/>
-          <w:szCs w:val="20"/>
-        </w:rPr>
-      </w:pPr>
-      <w:r>
-        <w:rPr>
+          <w:rFonts w:ascii="Abadi" w:hAnsi="Abadi"/>
+          <w:i/>
+          <w:iCs/>
+          <w:color w:val="6B7280"/>
+          <w:sz w:val="20"/>
+          <w:szCs w:val="20"/>
+        </w:rPr>
+      </w:pPr>
+      <w:r>
+        <w:rPr>
+          <w:rFonts w:ascii="Abadi" w:hAnsi="Abadi"/>
           <w:i/>
           <w:iCs/>
           <w:color w:val="6B7280"/>
@@ -2026,263 +3728,21 @@
       <w:pPr>
         <w:spacing w:after="240"/>
         <w:jc w:val="center"/>
-      </w:pPr>
-    </w:p>
-    <w:p>
-      <w:pPr>
-        <w:pStyle w:val="Heading1"/>
-        <w:spacing w:before="360" w:after="180"/>
-      </w:pPr>
-      <w:r>
-        <w:rPr>
-          <w:b/>
-          <w:bCs/>
-          <w:color w:val="145A3A"/>
-        </w:rPr>
-        <w:t>Quick Reference</w:t>
-      </w:r>
-    </w:p>
-    <w:tbl>
-      <w:tblPr>
-        <w:tblW w:w="5000" w:type="pct"/>
-        <w:tblBorders>
-          <w:top w:val="single" w:sz="4" w:space="0" w:color="auto"/>
-          <w:left w:val="single" w:sz="4" w:space="0" w:color="auto"/>
-          <w:bottom w:val="single" w:sz="4" w:space="0" w:color="auto"/>
-          <w:right w:val="single" w:sz="4" w:space="0" w:color="auto"/>
-          <w:insideH w:val="single" w:sz="4" w:space="0" w:color="auto"/>
-          <w:insideV w:val="single" w:sz="4" w:space="0" w:color="auto"/>
-        </w:tblBorders>
-        <w:tblLook w:val="04A0" w:firstRow="1" w:lastRow="0" w:firstColumn="1" w:lastColumn="0" w:noHBand="0" w:noVBand="1"/>
-      </w:tblPr>
-      <w:tblGrid>
-        <w:gridCol w:w="1819"/>
-        <w:gridCol w:w="7197"/>
-      </w:tblGrid>
-      <w:tr>
-        <w:trPr>
-          <w:tblHeader/>
-        </w:trPr>
-        <w:tc>
-          <w:tcPr>
-            <w:tcW w:w="0" w:type="auto"/>
-            <w:shd w:val="solid" w:color="145A3A" w:fill="145A3A"/>
-          </w:tcPr>
-          <w:p>
-            <w:r>
-              <w:rPr>
-                <w:b/>
-                <w:bCs/>
-                <w:color w:val="FFFFFF"/>
-              </w:rPr>
-              <w:t>Button</w:t>
-            </w:r>
-          </w:p>
-        </w:tc>
-        <w:tc>
-          <w:tcPr>
-            <w:tcW w:w="0" w:type="auto"/>
-            <w:shd w:val="solid" w:color="145A3A" w:fill="145A3A"/>
-          </w:tcPr>
-          <w:p>
-            <w:r>
-              <w:rPr>
-                <w:b/>
-                <w:bCs/>
-                <w:color w:val="FFFFFF"/>
-              </w:rPr>
-              <w:t>What it does</w:t>
-            </w:r>
-          </w:p>
-        </w:tc>
-      </w:tr>
-      <w:tr>
-        <w:tc>
-          <w:tcPr>
-            <w:tcW w:w="0" w:type="auto"/>
-          </w:tcPr>
-          <w:p>
-            <w:r>
-              <w:rPr>
-                <w:b/>
-                <w:bCs/>
-              </w:rPr>
-              <w:t>View Checklist</w:t>
-            </w:r>
-          </w:p>
-        </w:tc>
-        <w:tc>
-          <w:tcPr>
-            <w:tcW w:w="0" w:type="auto"/>
-          </w:tcPr>
-          <w:p>
-            <w:r>
-              <w:t>Open the checklist to review tasks, save progress, decline/hold, or approve.</w:t>
-            </w:r>
-          </w:p>
-        </w:tc>
-      </w:tr>
-      <w:tr>
-        <w:tc>
-          <w:tcPr>
-            <w:tcW w:w="0" w:type="auto"/>
-          </w:tcPr>
-          <w:p>
-            <w:r>
-              <w:rPr>
-                <w:b/>
-                <w:bCs/>
-              </w:rPr>
-              <w:t>Checklist Status</w:t>
-            </w:r>
-          </w:p>
-        </w:tc>
-        <w:tc>
-          <w:tcPr>
-            <w:tcW w:w="0" w:type="auto"/>
-          </w:tcPr>
-          <w:p>
-            <w:r>
-              <w:t>View a read-only timeline of the employee’s full offboarding progress.</w:t>
-            </w:r>
-          </w:p>
-        </w:tc>
-      </w:tr>
-      <w:tr>
-        <w:tc>
-          <w:tcPr>
-            <w:tcW w:w="0" w:type="auto"/>
-          </w:tcPr>
-          <w:p>
-            <w:r>
-              <w:rPr>
-                <w:b/>
-                <w:bCs/>
-              </w:rPr>
-              <w:t>Assign Checklist</w:t>
-            </w:r>
-          </w:p>
-        </w:tc>
-        <w:tc>
-          <w:tcPr>
-            <w:tcW w:w="0" w:type="auto"/>
-          </w:tcPr>
-          <w:p>
-            <w:r>
-              <w:t>Reassign unfinished tasks on this checklist to another employee.</w:t>
-            </w:r>
-          </w:p>
-        </w:tc>
-      </w:tr>
-      <w:tr>
-        <w:tc>
-          <w:tcPr>
-            <w:tcW w:w="0" w:type="auto"/>
-          </w:tcPr>
-          <w:p>
-            <w:r>
-              <w:rPr>
-                <w:b/>
-                <w:bCs/>
-              </w:rPr>
-              <w:t>Save Progress</w:t>
-            </w:r>
-          </w:p>
-        </w:tc>
-        <w:tc>
-          <w:tcPr>
-            <w:tcW w:w="0" w:type="auto"/>
-          </w:tcPr>
-          <w:p>
-            <w:r>
-              <w:t>Record which task(s) you have checked/cleared.</w:t>
-            </w:r>
-          </w:p>
-        </w:tc>
-      </w:tr>
-      <w:tr>
-        <w:tc>
-          <w:tcPr>
-            <w:tcW w:w="0" w:type="auto"/>
-          </w:tcPr>
-          <w:p>
-            <w:r>
-              <w:rPr>
-                <w:b/>
-                <w:bCs/>
-              </w:rPr>
-              <w:t>Decline</w:t>
-            </w:r>
-          </w:p>
-        </w:tc>
-        <w:tc>
-          <w:tcPr>
-            <w:tcW w:w="0" w:type="auto"/>
-          </w:tcPr>
-          <w:p>
-            <w:r>
-              <w:t>Place the checklist on hold, with a required reason.</w:t>
-            </w:r>
-          </w:p>
-        </w:tc>
-      </w:tr>
-      <w:tr>
-        <w:tc>
-          <w:tcPr>
-            <w:tcW w:w="0" w:type="auto"/>
-          </w:tcPr>
-          <w:p>
-            <w:r>
-              <w:rPr>
-                <w:b/>
-                <w:bCs/>
-              </w:rPr>
-              <w:t>Remove On Hold</w:t>
-            </w:r>
-          </w:p>
-        </w:tc>
-        <w:tc>
-          <w:tcPr>
-            <w:tcW w:w="0" w:type="auto"/>
-          </w:tcPr>
-          <w:p>
-            <w:r>
-              <w:t>Resume a held checklist, with a required remark.</w:t>
-            </w:r>
-          </w:p>
-        </w:tc>
-      </w:tr>
-      <w:tr>
-        <w:tc>
-          <w:tcPr>
-            <w:tcW w:w="0" w:type="auto"/>
-          </w:tcPr>
-          <w:p>
-            <w:r>
-              <w:rPr>
-                <w:b/>
-                <w:bCs/>
-              </w:rPr>
-              <w:t>Approve</w:t>
-            </w:r>
-          </w:p>
-        </w:tc>
-        <w:tc>
-          <w:tcPr>
-            <w:tcW w:w="0" w:type="auto"/>
-          </w:tcPr>
-          <w:p>
-            <w:r>
-              <w:t>Submit final approval — only enabled once every task is checked.</w:t>
-            </w:r>
-          </w:p>
-        </w:tc>
-      </w:tr>
-    </w:tbl>
-    <w:p/>
+        <w:rPr>
+          <w:rFonts w:ascii="Abadi" w:hAnsi="Abadi"/>
+        </w:rPr>
+      </w:pPr>
+    </w:p>
+    <w:p>
+      <w:pPr>
+        <w:rPr>
+          <w:rFonts w:ascii="Abadi" w:hAnsi="Abadi"/>
+        </w:rPr>
+      </w:pPr>
+    </w:p>
     <w:sectPr>
-      <w:headerReference w:type="default" r:id="rId24"/>
-      <w:footerReference w:type="default" r:id="rId25"/>
+      <w:headerReference w:type="default" r:id="rId26"/>
+      <w:footerReference w:type="default" r:id="rId27"/>
       <w:pgSz w:w="11906" w:h="16838"/>
       <w:pgMar w:top="1440" w:right="1440" w:bottom="1440" w:left="1440" w:header="708" w:footer="708" w:gutter="0"/>
       <w:cols w:space="720"/>
@@ -2890,11 +4350,13 @@
   <w:style w:type="paragraph" w:default="1" w:styleId="Normal">
     <w:name w:val="Normal"/>
     <w:qFormat/>
+    <w:rsid w:val="00681437"/>
   </w:style>
   <w:style w:type="paragraph" w:styleId="Heading1">
     <w:name w:val="heading 1"/>
     <w:basedOn w:val="Normal"/>
     <w:next w:val="Normal"/>
+    <w:link w:val="Heading1Char"/>
     <w:uiPriority w:val="9"/>
     <w:qFormat/>
     <w:pPr>
@@ -3154,6 +4616,18 @@
     <w:link w:val="Footer"/>
     <w:uiPriority w:val="99"/>
     <w:rsid w:val="009F3ABF"/>
+  </w:style>
+  <w:style w:type="character" w:customStyle="1" w:styleId="Heading1Char">
+    <w:name w:val="Heading 1 Char"/>
+    <w:basedOn w:val="DefaultParagraphFont"/>
+    <w:link w:val="Heading1"/>
+    <w:uiPriority w:val="9"/>
+    <w:rsid w:val="0050394C"/>
+    <w:rPr>
+      <w:color w:val="2E74B5"/>
+      <w:sz w:val="32"/>
+      <w:szCs w:val="32"/>
+    </w:rPr>
   </w:style>
 </w:styles>
 </file>

</xml_diff>